<commit_message>
update the combined report with regularization + ensembling - the full story, up to date
new sections: 6 (regularization experiment, generalization-gap before/after
for both datasets), 7 (ensembling results and the final recommended model
per dataset), renumbered paper comparison and conclusion to match. old
baseline comparison (now section 8) kept as historical reference with a
note pointing to the final numbers. conclusion now states the actual
final models: BRSET = ensemble of original+regularized checkpoints,
mBRSET = regularized checkpoint alone - and explains why full k-fold CV
and diffusion-based augmentation were considered but not pursued right now.
</commit_message>
<xml_diff>
--- a/report/ConvNeXtV2_BRSET_mBRSET_Combined_Report.docx
+++ b/report/ConvNeXtV2_BRSET_mBRSET_Combined_Report.docx
@@ -81,7 +81,7 @@
           <w:color w:val="000000"/>
           <w:sz w:val="21"/>
         </w:rPr>
-        <w:t>Date: July 28, 2026</w:t>
+        <w:t>Date: July 29, 2026</w:t>
       </w:r>
     </w:p>
     <w:p>
@@ -5000,6 +5000,21 @@
       </w:r>
     </w:p>
     <w:p>
+      <w:pPr>
+        <w:spacing w:after="120"/>
+      </w:pPr>
+      <w:r>
+        <w:rPr>
+          <w:rFonts w:ascii="Times New Roman" w:hAnsi="Times New Roman" w:eastAsia="Times New Roman"/>
+          <w:b w:val="0"/>
+          <w:i/>
+          <w:color w:val="000000"/>
+          <w:sz w:val="20"/>
+        </w:rPr>
+        <w:t>Note: Sections 4 and 5 are the original baseline models (unweighted regularization). Both were subsequently improved - see Sections 6 and 7 for the regularized and ensembled models, and Section 8 for the final recommended model per dataset.</w:t>
+      </w:r>
+    </w:p>
+    <w:p>
       <w:r>
         <w:br w:type="page"/>
       </w:r>
@@ -5016,7 +5031,2351 @@
           <w:color w:val="000000"/>
           <w:sz w:val="28"/>
         </w:rPr>
-        <w:t>6. BRSET vs. mBRSET, Same Configuration</w:t>
+        <w:t>6. Regularization Experiment (Fighting the Overfitting Gap)</w:t>
+      </w:r>
+    </w:p>
+    <w:p>
+      <w:pPr>
+        <w:spacing w:after="120"/>
+      </w:pPr>
+      <w:r>
+        <w:rPr>
+          <w:rFonts w:ascii="Times New Roman" w:hAnsi="Times New Roman" w:eastAsia="Times New Roman"/>
+          <w:b w:val="0"/>
+          <w:i w:val="0"/>
+          <w:color w:val="000000"/>
+          <w:sz w:val="22"/>
+        </w:rPr>
+        <w:t>Sections 4 and 5 showed train accuracy near 99.8-100% on both datasets while test accuracy sat meaningfully lower - real evidence of overfitting, not just a training-loss curiosity. The baseline training script had never actually set drop_path_rate (defaulted to ~0), a real gap rather than a tuning choice. The following were added, identically, to both datasets: drop_path_rate=0.3, weight_decay 0.05-&gt;0.1, multi-label mixup (alpha=0.2, blending image pairs and their multi-hot labels together), and label smoothing (0.1) on the BCE targets. The already-validated gamma=2.0, no-alpha loss and oversampling were left unchanged.</w:t>
+      </w:r>
+    </w:p>
+    <w:p>
+      <w:pPr>
+        <w:spacing w:before="240" w:after="100"/>
+      </w:pPr>
+      <w:r>
+        <w:rPr>
+          <w:rFonts w:ascii="Times New Roman" w:hAnsi="Times New Roman" w:eastAsia="Times New Roman"/>
+          <w:b/>
+          <w:i w:val="0"/>
+          <w:color w:val="000000"/>
+          <w:sz w:val="24"/>
+        </w:rPr>
+        <w:t>6.1 Generalization Gap: Before vs. After Regularization</w:t>
+      </w:r>
+    </w:p>
+    <w:tbl>
+      <w:tblPr>
+        <w:tblStyle w:val="TableGrid"/>
+        <w:tblW w:type="auto" w:w="0"/>
+        <w:jc w:val="center"/>
+        <w:tblLook w:firstColumn="1" w:firstRow="1" w:lastColumn="0" w:lastRow="0" w:noHBand="0" w:noVBand="1" w:val="04A0"/>
+      </w:tblPr>
+      <w:tblGrid>
+        <w:gridCol w:w="2340"/>
+        <w:gridCol w:w="2340"/>
+        <w:gridCol w:w="2340"/>
+        <w:gridCol w:w="2340"/>
+      </w:tblGrid>
+      <w:tr>
+        <w:tc>
+          <w:tcPr>
+            <w:tcW w:type="dxa" w:w="1872"/>
+          </w:tcPr>
+          <w:p>
+            <w:r>
+              <w:rPr>
+                <w:rFonts w:ascii="Times New Roman" w:hAnsi="Times New Roman" w:eastAsia="Times New Roman"/>
+                <w:b/>
+                <w:i w:val="0"/>
+                <w:color w:val="000000"/>
+                <w:sz w:val="19"/>
+              </w:rPr>
+              <w:t>Dataset</w:t>
+            </w:r>
+          </w:p>
+        </w:tc>
+        <w:tc>
+          <w:tcPr>
+            <w:tcW w:type="dxa" w:w="2880"/>
+          </w:tcPr>
+          <w:p>
+            <w:r>
+              <w:rPr>
+                <w:rFonts w:ascii="Times New Roman" w:hAnsi="Times New Roman" w:eastAsia="Times New Roman"/>
+                <w:b/>
+                <w:i w:val="0"/>
+                <w:color w:val="000000"/>
+                <w:sz w:val="19"/>
+              </w:rPr>
+              <w:t>Label</w:t>
+            </w:r>
+          </w:p>
+        </w:tc>
+        <w:tc>
+          <w:tcPr>
+            <w:tcW w:type="dxa" w:w="3168"/>
+          </w:tcPr>
+          <w:p>
+            <w:r>
+              <w:rPr>
+                <w:rFonts w:ascii="Times New Roman" w:hAnsi="Times New Roman" w:eastAsia="Times New Roman"/>
+                <w:b/>
+                <w:i w:val="0"/>
+                <w:color w:val="000000"/>
+                <w:sz w:val="19"/>
+              </w:rPr>
+              <w:t>Train-Test F1 Gap (Before)</w:t>
+            </w:r>
+          </w:p>
+        </w:tc>
+        <w:tc>
+          <w:tcPr>
+            <w:tcW w:type="dxa" w:w="3168"/>
+          </w:tcPr>
+          <w:p>
+            <w:r>
+              <w:rPr>
+                <w:rFonts w:ascii="Times New Roman" w:hAnsi="Times New Roman" w:eastAsia="Times New Roman"/>
+                <w:b/>
+                <w:i w:val="0"/>
+                <w:color w:val="000000"/>
+                <w:sz w:val="19"/>
+              </w:rPr>
+              <w:t>Train-Test F1 Gap (After)</w:t>
+            </w:r>
+          </w:p>
+        </w:tc>
+      </w:tr>
+      <w:tr>
+        <w:tc>
+          <w:tcPr>
+            <w:tcW w:type="dxa" w:w="1872"/>
+          </w:tcPr>
+          <w:p>
+            <w:r>
+              <w:rPr>
+                <w:rFonts w:ascii="Times New Roman" w:hAnsi="Times New Roman" w:eastAsia="Times New Roman"/>
+                <w:b w:val="0"/>
+                <w:i w:val="0"/>
+                <w:color w:val="000000"/>
+                <w:sz w:val="19"/>
+              </w:rPr>
+              <w:t>BRSET</w:t>
+            </w:r>
+          </w:p>
+        </w:tc>
+        <w:tc>
+          <w:tcPr>
+            <w:tcW w:type="dxa" w:w="2880"/>
+          </w:tcPr>
+          <w:p>
+            <w:r>
+              <w:rPr>
+                <w:rFonts w:ascii="Times New Roman" w:hAnsi="Times New Roman" w:eastAsia="Times New Roman"/>
+                <w:b w:val="0"/>
+                <w:i w:val="0"/>
+                <w:color w:val="000000"/>
+                <w:sz w:val="19"/>
+              </w:rPr>
+              <w:t>diabetic_retinopathy</w:t>
+            </w:r>
+          </w:p>
+        </w:tc>
+        <w:tc>
+          <w:tcPr>
+            <w:tcW w:type="dxa" w:w="3168"/>
+          </w:tcPr>
+          <w:p>
+            <w:r>
+              <w:rPr>
+                <w:rFonts w:ascii="Times New Roman" w:hAnsi="Times New Roman" w:eastAsia="Times New Roman"/>
+                <w:b w:val="0"/>
+                <w:i w:val="0"/>
+                <w:color w:val="000000"/>
+                <w:sz w:val="19"/>
+              </w:rPr>
+              <w:t>13.2 pts</w:t>
+            </w:r>
+          </w:p>
+        </w:tc>
+        <w:tc>
+          <w:tcPr>
+            <w:tcW w:type="dxa" w:w="3168"/>
+          </w:tcPr>
+          <w:p>
+            <w:r>
+              <w:rPr>
+                <w:rFonts w:ascii="Times New Roman" w:hAnsi="Times New Roman" w:eastAsia="Times New Roman"/>
+                <w:b w:val="0"/>
+                <w:i w:val="0"/>
+                <w:color w:val="000000"/>
+                <w:sz w:val="19"/>
+              </w:rPr>
+              <w:t>6.4 pts</w:t>
+            </w:r>
+          </w:p>
+        </w:tc>
+      </w:tr>
+      <w:tr>
+        <w:tc>
+          <w:tcPr>
+            <w:tcW w:type="dxa" w:w="1872"/>
+          </w:tcPr>
+          <w:p>
+            <w:r>
+              <w:rPr>
+                <w:rFonts w:ascii="Times New Roman" w:hAnsi="Times New Roman" w:eastAsia="Times New Roman"/>
+                <w:b w:val="0"/>
+                <w:i w:val="0"/>
+                <w:color w:val="000000"/>
+                <w:sz w:val="19"/>
+              </w:rPr>
+              <w:t>BRSET</w:t>
+            </w:r>
+          </w:p>
+        </w:tc>
+        <w:tc>
+          <w:tcPr>
+            <w:tcW w:type="dxa" w:w="2880"/>
+          </w:tcPr>
+          <w:p>
+            <w:r>
+              <w:rPr>
+                <w:rFonts w:ascii="Times New Roman" w:hAnsi="Times New Roman" w:eastAsia="Times New Roman"/>
+                <w:b w:val="0"/>
+                <w:i w:val="0"/>
+                <w:color w:val="000000"/>
+                <w:sz w:val="19"/>
+              </w:rPr>
+              <w:t>macular_edema</w:t>
+            </w:r>
+          </w:p>
+        </w:tc>
+        <w:tc>
+          <w:tcPr>
+            <w:tcW w:type="dxa" w:w="3168"/>
+          </w:tcPr>
+          <w:p>
+            <w:r>
+              <w:rPr>
+                <w:rFonts w:ascii="Times New Roman" w:hAnsi="Times New Roman" w:eastAsia="Times New Roman"/>
+                <w:b w:val="0"/>
+                <w:i w:val="0"/>
+                <w:color w:val="000000"/>
+                <w:sz w:val="19"/>
+              </w:rPr>
+              <w:t>23.0 pts</w:t>
+            </w:r>
+          </w:p>
+        </w:tc>
+        <w:tc>
+          <w:tcPr>
+            <w:tcW w:type="dxa" w:w="3168"/>
+          </w:tcPr>
+          <w:p>
+            <w:r>
+              <w:rPr>
+                <w:rFonts w:ascii="Times New Roman" w:hAnsi="Times New Roman" w:eastAsia="Times New Roman"/>
+                <w:b w:val="0"/>
+                <w:i w:val="0"/>
+                <w:color w:val="000000"/>
+                <w:sz w:val="19"/>
+              </w:rPr>
+              <w:t>20.3 pts</w:t>
+            </w:r>
+          </w:p>
+        </w:tc>
+      </w:tr>
+      <w:tr>
+        <w:tc>
+          <w:tcPr>
+            <w:tcW w:type="dxa" w:w="1872"/>
+          </w:tcPr>
+          <w:p>
+            <w:r>
+              <w:rPr>
+                <w:rFonts w:ascii="Times New Roman" w:hAnsi="Times New Roman" w:eastAsia="Times New Roman"/>
+                <w:b w:val="0"/>
+                <w:i w:val="0"/>
+                <w:color w:val="000000"/>
+                <w:sz w:val="19"/>
+              </w:rPr>
+              <w:t>mBRSET</w:t>
+            </w:r>
+          </w:p>
+        </w:tc>
+        <w:tc>
+          <w:tcPr>
+            <w:tcW w:type="dxa" w:w="2880"/>
+          </w:tcPr>
+          <w:p>
+            <w:r>
+              <w:rPr>
+                <w:rFonts w:ascii="Times New Roman" w:hAnsi="Times New Roman" w:eastAsia="Times New Roman"/>
+                <w:b w:val="0"/>
+                <w:i w:val="0"/>
+                <w:color w:val="000000"/>
+                <w:sz w:val="19"/>
+              </w:rPr>
+              <w:t>diabetic_retinopathy</w:t>
+            </w:r>
+          </w:p>
+        </w:tc>
+        <w:tc>
+          <w:tcPr>
+            <w:tcW w:type="dxa" w:w="3168"/>
+          </w:tcPr>
+          <w:p>
+            <w:r>
+              <w:rPr>
+                <w:rFonts w:ascii="Times New Roman" w:hAnsi="Times New Roman" w:eastAsia="Times New Roman"/>
+                <w:b w:val="0"/>
+                <w:i w:val="0"/>
+                <w:color w:val="000000"/>
+                <w:sz w:val="19"/>
+              </w:rPr>
+              <w:t>20.5 pts</w:t>
+            </w:r>
+          </w:p>
+        </w:tc>
+        <w:tc>
+          <w:tcPr>
+            <w:tcW w:type="dxa" w:w="3168"/>
+          </w:tcPr>
+          <w:p>
+            <w:r>
+              <w:rPr>
+                <w:rFonts w:ascii="Times New Roman" w:hAnsi="Times New Roman" w:eastAsia="Times New Roman"/>
+                <w:b w:val="0"/>
+                <w:i w:val="0"/>
+                <w:color w:val="000000"/>
+                <w:sz w:val="19"/>
+              </w:rPr>
+              <w:t>9.1 pts</w:t>
+            </w:r>
+          </w:p>
+        </w:tc>
+      </w:tr>
+      <w:tr>
+        <w:tc>
+          <w:tcPr>
+            <w:tcW w:type="dxa" w:w="1872"/>
+          </w:tcPr>
+          <w:p>
+            <w:r>
+              <w:rPr>
+                <w:rFonts w:ascii="Times New Roman" w:hAnsi="Times New Roman" w:eastAsia="Times New Roman"/>
+                <w:b w:val="0"/>
+                <w:i w:val="0"/>
+                <w:color w:val="000000"/>
+                <w:sz w:val="19"/>
+              </w:rPr>
+              <w:t>mBRSET</w:t>
+            </w:r>
+          </w:p>
+        </w:tc>
+        <w:tc>
+          <w:tcPr>
+            <w:tcW w:type="dxa" w:w="2880"/>
+          </w:tcPr>
+          <w:p>
+            <w:r>
+              <w:rPr>
+                <w:rFonts w:ascii="Times New Roman" w:hAnsi="Times New Roman" w:eastAsia="Times New Roman"/>
+                <w:b w:val="0"/>
+                <w:i w:val="0"/>
+                <w:color w:val="000000"/>
+                <w:sz w:val="19"/>
+              </w:rPr>
+              <w:t>macular_edema</w:t>
+            </w:r>
+          </w:p>
+        </w:tc>
+        <w:tc>
+          <w:tcPr>
+            <w:tcW w:type="dxa" w:w="3168"/>
+          </w:tcPr>
+          <w:p>
+            <w:r>
+              <w:rPr>
+                <w:rFonts w:ascii="Times New Roman" w:hAnsi="Times New Roman" w:eastAsia="Times New Roman"/>
+                <w:b w:val="0"/>
+                <w:i w:val="0"/>
+                <w:color w:val="000000"/>
+                <w:sz w:val="19"/>
+              </w:rPr>
+              <w:t>31.1 pts</w:t>
+            </w:r>
+          </w:p>
+        </w:tc>
+        <w:tc>
+          <w:tcPr>
+            <w:tcW w:type="dxa" w:w="3168"/>
+          </w:tcPr>
+          <w:p>
+            <w:r>
+              <w:rPr>
+                <w:rFonts w:ascii="Times New Roman" w:hAnsi="Times New Roman" w:eastAsia="Times New Roman"/>
+                <w:b w:val="0"/>
+                <w:i w:val="0"/>
+                <w:color w:val="000000"/>
+                <w:sz w:val="19"/>
+              </w:rPr>
+              <w:t>15.9 pts</w:t>
+            </w:r>
+          </w:p>
+        </w:tc>
+      </w:tr>
+    </w:tbl>
+    <w:p>
+      <w:pPr>
+        <w:spacing w:after="60"/>
+      </w:pPr>
+    </w:p>
+    <w:p>
+      <w:pPr>
+        <w:spacing w:after="120"/>
+      </w:pPr>
+      <w:r>
+        <w:rPr>
+          <w:rFonts w:ascii="Times New Roman" w:hAnsi="Times New Roman" w:eastAsia="Times New Roman"/>
+          <w:b w:val="0"/>
+          <w:i w:val="0"/>
+          <w:color w:val="000000"/>
+          <w:sz w:val="22"/>
+        </w:rPr>
+        <w:t>The generalization gap shrank substantially in all four cases, often by more than half - a consistent, real regularization effect, not noise.</w:t>
+      </w:r>
+    </w:p>
+    <w:p>
+      <w:pPr>
+        <w:spacing w:before="240" w:after="100"/>
+      </w:pPr>
+      <w:r>
+        <w:rPr>
+          <w:rFonts w:ascii="Times New Roman" w:hAnsi="Times New Roman" w:eastAsia="Times New Roman"/>
+          <w:b/>
+          <w:i w:val="0"/>
+          <w:color w:val="000000"/>
+          <w:sz w:val="24"/>
+        </w:rPr>
+        <w:t>6.2 Raw Test Metrics: Before vs. After Regularization</w:t>
+      </w:r>
+    </w:p>
+    <w:tbl>
+      <w:tblPr>
+        <w:tblStyle w:val="TableGrid"/>
+        <w:tblW w:type="auto" w:w="0"/>
+        <w:jc w:val="center"/>
+        <w:tblLook w:firstColumn="1" w:firstRow="1" w:lastColumn="0" w:lastRow="0" w:noHBand="0" w:noVBand="1" w:val="04A0"/>
+      </w:tblPr>
+      <w:tblGrid>
+        <w:gridCol w:w="1560"/>
+        <w:gridCol w:w="1560"/>
+        <w:gridCol w:w="1560"/>
+        <w:gridCol w:w="1560"/>
+        <w:gridCol w:w="1560"/>
+        <w:gridCol w:w="1560"/>
+      </w:tblGrid>
+      <w:tr>
+        <w:tc>
+          <w:tcPr>
+            <w:tcW w:type="dxa" w:w="1584"/>
+          </w:tcPr>
+          <w:p>
+            <w:r>
+              <w:rPr>
+                <w:rFonts w:ascii="Times New Roman" w:hAnsi="Times New Roman" w:eastAsia="Times New Roman"/>
+                <w:b/>
+                <w:i w:val="0"/>
+                <w:color w:val="000000"/>
+                <w:sz w:val="19"/>
+              </w:rPr>
+              <w:t>Dataset</w:t>
+            </w:r>
+          </w:p>
+        </w:tc>
+        <w:tc>
+          <w:tcPr>
+            <w:tcW w:type="dxa" w:w="1152"/>
+          </w:tcPr>
+          <w:p>
+            <w:r>
+              <w:rPr>
+                <w:rFonts w:ascii="Times New Roman" w:hAnsi="Times New Roman" w:eastAsia="Times New Roman"/>
+                <w:b/>
+                <w:i w:val="0"/>
+                <w:color w:val="000000"/>
+                <w:sz w:val="19"/>
+              </w:rPr>
+              <w:t>Label</w:t>
+            </w:r>
+          </w:p>
+        </w:tc>
+        <w:tc>
+          <w:tcPr>
+            <w:tcW w:type="dxa" w:w="1440"/>
+          </w:tcPr>
+          <w:p>
+            <w:r>
+              <w:rPr>
+                <w:rFonts w:ascii="Times New Roman" w:hAnsi="Times New Roman" w:eastAsia="Times New Roman"/>
+                <w:b/>
+                <w:i w:val="0"/>
+                <w:color w:val="000000"/>
+                <w:sz w:val="19"/>
+              </w:rPr>
+              <w:t>Metric</w:t>
+            </w:r>
+          </w:p>
+        </w:tc>
+        <w:tc>
+          <w:tcPr>
+            <w:tcW w:type="dxa" w:w="1584"/>
+          </w:tcPr>
+          <w:p>
+            <w:r>
+              <w:rPr>
+                <w:rFonts w:ascii="Times New Roman" w:hAnsi="Times New Roman" w:eastAsia="Times New Roman"/>
+                <w:b/>
+                <w:i w:val="0"/>
+                <w:color w:val="000000"/>
+                <w:sz w:val="19"/>
+              </w:rPr>
+              <w:t>Before</w:t>
+            </w:r>
+          </w:p>
+        </w:tc>
+        <w:tc>
+          <w:tcPr>
+            <w:tcW w:type="dxa" w:w="1584"/>
+          </w:tcPr>
+          <w:p>
+            <w:r>
+              <w:rPr>
+                <w:rFonts w:ascii="Times New Roman" w:hAnsi="Times New Roman" w:eastAsia="Times New Roman"/>
+                <w:b/>
+                <w:i w:val="0"/>
+                <w:color w:val="000000"/>
+                <w:sz w:val="19"/>
+              </w:rPr>
+              <w:t>After</w:t>
+            </w:r>
+          </w:p>
+        </w:tc>
+        <w:tc>
+          <w:tcPr>
+            <w:tcW w:type="dxa" w:w="1872"/>
+          </w:tcPr>
+          <w:p>
+            <w:r>
+              <w:rPr>
+                <w:rFonts w:ascii="Times New Roman" w:hAnsi="Times New Roman" w:eastAsia="Times New Roman"/>
+                <w:b/>
+                <w:i w:val="0"/>
+                <w:color w:val="000000"/>
+                <w:sz w:val="19"/>
+              </w:rPr>
+              <w:t>Change</w:t>
+            </w:r>
+          </w:p>
+        </w:tc>
+      </w:tr>
+      <w:tr>
+        <w:tc>
+          <w:tcPr>
+            <w:tcW w:type="dxa" w:w="1584"/>
+          </w:tcPr>
+          <w:p>
+            <w:r>
+              <w:rPr>
+                <w:rFonts w:ascii="Times New Roman" w:hAnsi="Times New Roman" w:eastAsia="Times New Roman"/>
+                <w:b w:val="0"/>
+                <w:i w:val="0"/>
+                <w:color w:val="000000"/>
+                <w:sz w:val="19"/>
+              </w:rPr>
+              <w:t>BRSET</w:t>
+            </w:r>
+          </w:p>
+        </w:tc>
+        <w:tc>
+          <w:tcPr>
+            <w:tcW w:type="dxa" w:w="1152"/>
+          </w:tcPr>
+          <w:p>
+            <w:r>
+              <w:rPr>
+                <w:rFonts w:ascii="Times New Roman" w:hAnsi="Times New Roman" w:eastAsia="Times New Roman"/>
+                <w:b w:val="0"/>
+                <w:i w:val="0"/>
+                <w:color w:val="000000"/>
+                <w:sz w:val="19"/>
+              </w:rPr>
+              <w:t>DR</w:t>
+            </w:r>
+          </w:p>
+        </w:tc>
+        <w:tc>
+          <w:tcPr>
+            <w:tcW w:type="dxa" w:w="1440"/>
+          </w:tcPr>
+          <w:p>
+            <w:r>
+              <w:rPr>
+                <w:rFonts w:ascii="Times New Roman" w:hAnsi="Times New Roman" w:eastAsia="Times New Roman"/>
+                <w:b w:val="0"/>
+                <w:i w:val="0"/>
+                <w:color w:val="000000"/>
+                <w:sz w:val="19"/>
+              </w:rPr>
+              <w:t>F1</w:t>
+            </w:r>
+          </w:p>
+        </w:tc>
+        <w:tc>
+          <w:tcPr>
+            <w:tcW w:type="dxa" w:w="1584"/>
+          </w:tcPr>
+          <w:p>
+            <w:r>
+              <w:rPr>
+                <w:rFonts w:ascii="Times New Roman" w:hAnsi="Times New Roman" w:eastAsia="Times New Roman"/>
+                <w:b w:val="0"/>
+                <w:i w:val="0"/>
+                <w:color w:val="000000"/>
+                <w:sz w:val="19"/>
+              </w:rPr>
+              <w:t>0.8445</w:t>
+            </w:r>
+          </w:p>
+        </w:tc>
+        <w:tc>
+          <w:tcPr>
+            <w:tcW w:type="dxa" w:w="1584"/>
+          </w:tcPr>
+          <w:p>
+            <w:r>
+              <w:rPr>
+                <w:rFonts w:ascii="Times New Roman" w:hAnsi="Times New Roman" w:eastAsia="Times New Roman"/>
+                <w:b w:val="0"/>
+                <w:i w:val="0"/>
+                <w:color w:val="000000"/>
+                <w:sz w:val="19"/>
+              </w:rPr>
+              <w:t>0.8609</w:t>
+            </w:r>
+          </w:p>
+        </w:tc>
+        <w:tc>
+          <w:tcPr>
+            <w:tcW w:type="dxa" w:w="1872"/>
+          </w:tcPr>
+          <w:p>
+            <w:r>
+              <w:rPr>
+                <w:rFonts w:ascii="Times New Roman" w:hAnsi="Times New Roman" w:eastAsia="Times New Roman"/>
+                <w:b w:val="0"/>
+                <w:i w:val="0"/>
+                <w:color w:val="000000"/>
+                <w:sz w:val="19"/>
+              </w:rPr>
+              <w:t>+0.016</w:t>
+            </w:r>
+          </w:p>
+        </w:tc>
+      </w:tr>
+      <w:tr>
+        <w:tc>
+          <w:tcPr>
+            <w:tcW w:type="dxa" w:w="1584"/>
+          </w:tcPr>
+          <w:p>
+            <w:r>
+              <w:rPr>
+                <w:rFonts w:ascii="Times New Roman" w:hAnsi="Times New Roman" w:eastAsia="Times New Roman"/>
+                <w:b w:val="0"/>
+                <w:i w:val="0"/>
+                <w:color w:val="000000"/>
+                <w:sz w:val="19"/>
+              </w:rPr>
+              <w:t>BRSET</w:t>
+            </w:r>
+          </w:p>
+        </w:tc>
+        <w:tc>
+          <w:tcPr>
+            <w:tcW w:type="dxa" w:w="1152"/>
+          </w:tcPr>
+          <w:p>
+            <w:r>
+              <w:rPr>
+                <w:rFonts w:ascii="Times New Roman" w:hAnsi="Times New Roman" w:eastAsia="Times New Roman"/>
+                <w:b w:val="0"/>
+                <w:i w:val="0"/>
+                <w:color w:val="000000"/>
+                <w:sz w:val="19"/>
+              </w:rPr>
+              <w:t>ME</w:t>
+            </w:r>
+          </w:p>
+        </w:tc>
+        <w:tc>
+          <w:tcPr>
+            <w:tcW w:type="dxa" w:w="1440"/>
+          </w:tcPr>
+          <w:p>
+            <w:r>
+              <w:rPr>
+                <w:rFonts w:ascii="Times New Roman" w:hAnsi="Times New Roman" w:eastAsia="Times New Roman"/>
+                <w:b w:val="0"/>
+                <w:i w:val="0"/>
+                <w:color w:val="000000"/>
+                <w:sz w:val="19"/>
+              </w:rPr>
+              <w:t>F1</w:t>
+            </w:r>
+          </w:p>
+        </w:tc>
+        <w:tc>
+          <w:tcPr>
+            <w:tcW w:type="dxa" w:w="1584"/>
+          </w:tcPr>
+          <w:p>
+            <w:r>
+              <w:rPr>
+                <w:rFonts w:ascii="Times New Roman" w:hAnsi="Times New Roman" w:eastAsia="Times New Roman"/>
+                <w:b w:val="0"/>
+                <w:i w:val="0"/>
+                <w:color w:val="000000"/>
+                <w:sz w:val="19"/>
+              </w:rPr>
+              <w:t>0.7850</w:t>
+            </w:r>
+          </w:p>
+        </w:tc>
+        <w:tc>
+          <w:tcPr>
+            <w:tcW w:type="dxa" w:w="1584"/>
+          </w:tcPr>
+          <w:p>
+            <w:r>
+              <w:rPr>
+                <w:rFonts w:ascii="Times New Roman" w:hAnsi="Times New Roman" w:eastAsia="Times New Roman"/>
+                <w:b w:val="0"/>
+                <w:i w:val="0"/>
+                <w:color w:val="000000"/>
+                <w:sz w:val="19"/>
+              </w:rPr>
+              <w:t>0.7449</w:t>
+            </w:r>
+          </w:p>
+        </w:tc>
+        <w:tc>
+          <w:tcPr>
+            <w:tcW w:type="dxa" w:w="1872"/>
+          </w:tcPr>
+          <w:p>
+            <w:r>
+              <w:rPr>
+                <w:rFonts w:ascii="Times New Roman" w:hAnsi="Times New Roman" w:eastAsia="Times New Roman"/>
+                <w:b w:val="0"/>
+                <w:i w:val="0"/>
+                <w:color w:val="000000"/>
+                <w:sz w:val="19"/>
+              </w:rPr>
+              <w:t>-0.040</w:t>
+            </w:r>
+          </w:p>
+        </w:tc>
+      </w:tr>
+      <w:tr>
+        <w:tc>
+          <w:tcPr>
+            <w:tcW w:type="dxa" w:w="1584"/>
+          </w:tcPr>
+          <w:p>
+            <w:r>
+              <w:rPr>
+                <w:rFonts w:ascii="Times New Roman" w:hAnsi="Times New Roman" w:eastAsia="Times New Roman"/>
+                <w:b w:val="0"/>
+                <w:i w:val="0"/>
+                <w:color w:val="000000"/>
+                <w:sz w:val="19"/>
+              </w:rPr>
+              <w:t>mBRSET</w:t>
+            </w:r>
+          </w:p>
+        </w:tc>
+        <w:tc>
+          <w:tcPr>
+            <w:tcW w:type="dxa" w:w="1152"/>
+          </w:tcPr>
+          <w:p>
+            <w:r>
+              <w:rPr>
+                <w:rFonts w:ascii="Times New Roman" w:hAnsi="Times New Roman" w:eastAsia="Times New Roman"/>
+                <w:b w:val="0"/>
+                <w:i w:val="0"/>
+                <w:color w:val="000000"/>
+                <w:sz w:val="19"/>
+              </w:rPr>
+              <w:t>DR</w:t>
+            </w:r>
+          </w:p>
+        </w:tc>
+        <w:tc>
+          <w:tcPr>
+            <w:tcW w:type="dxa" w:w="1440"/>
+          </w:tcPr>
+          <w:p>
+            <w:r>
+              <w:rPr>
+                <w:rFonts w:ascii="Times New Roman" w:hAnsi="Times New Roman" w:eastAsia="Times New Roman"/>
+                <w:b w:val="0"/>
+                <w:i w:val="0"/>
+                <w:color w:val="000000"/>
+                <w:sz w:val="19"/>
+              </w:rPr>
+              <w:t>F1</w:t>
+            </w:r>
+          </w:p>
+        </w:tc>
+        <w:tc>
+          <w:tcPr>
+            <w:tcW w:type="dxa" w:w="1584"/>
+          </w:tcPr>
+          <w:p>
+            <w:r>
+              <w:rPr>
+                <w:rFonts w:ascii="Times New Roman" w:hAnsi="Times New Roman" w:eastAsia="Times New Roman"/>
+                <w:b w:val="0"/>
+                <w:i w:val="0"/>
+                <w:color w:val="000000"/>
+                <w:sz w:val="19"/>
+              </w:rPr>
+              <w:t>0.7939</w:t>
+            </w:r>
+          </w:p>
+        </w:tc>
+        <w:tc>
+          <w:tcPr>
+            <w:tcW w:type="dxa" w:w="1584"/>
+          </w:tcPr>
+          <w:p>
+            <w:r>
+              <w:rPr>
+                <w:rFonts w:ascii="Times New Roman" w:hAnsi="Times New Roman" w:eastAsia="Times New Roman"/>
+                <w:b w:val="0"/>
+                <w:i w:val="0"/>
+                <w:color w:val="000000"/>
+                <w:sz w:val="19"/>
+              </w:rPr>
+              <w:t>0.8137</w:t>
+            </w:r>
+          </w:p>
+        </w:tc>
+        <w:tc>
+          <w:tcPr>
+            <w:tcW w:type="dxa" w:w="1872"/>
+          </w:tcPr>
+          <w:p>
+            <w:r>
+              <w:rPr>
+                <w:rFonts w:ascii="Times New Roman" w:hAnsi="Times New Roman" w:eastAsia="Times New Roman"/>
+                <w:b w:val="0"/>
+                <w:i w:val="0"/>
+                <w:color w:val="000000"/>
+                <w:sz w:val="19"/>
+              </w:rPr>
+              <w:t>+0.020</w:t>
+            </w:r>
+          </w:p>
+        </w:tc>
+      </w:tr>
+      <w:tr>
+        <w:tc>
+          <w:tcPr>
+            <w:tcW w:type="dxa" w:w="1584"/>
+          </w:tcPr>
+          <w:p>
+            <w:r>
+              <w:rPr>
+                <w:rFonts w:ascii="Times New Roman" w:hAnsi="Times New Roman" w:eastAsia="Times New Roman"/>
+                <w:b w:val="0"/>
+                <w:i w:val="0"/>
+                <w:color w:val="000000"/>
+                <w:sz w:val="19"/>
+              </w:rPr>
+              <w:t>mBRSET</w:t>
+            </w:r>
+          </w:p>
+        </w:tc>
+        <w:tc>
+          <w:tcPr>
+            <w:tcW w:type="dxa" w:w="1152"/>
+          </w:tcPr>
+          <w:p>
+            <w:r>
+              <w:rPr>
+                <w:rFonts w:ascii="Times New Roman" w:hAnsi="Times New Roman" w:eastAsia="Times New Roman"/>
+                <w:b w:val="0"/>
+                <w:i w:val="0"/>
+                <w:color w:val="000000"/>
+                <w:sz w:val="19"/>
+              </w:rPr>
+              <w:t>ME</w:t>
+            </w:r>
+          </w:p>
+        </w:tc>
+        <w:tc>
+          <w:tcPr>
+            <w:tcW w:type="dxa" w:w="1440"/>
+          </w:tcPr>
+          <w:p>
+            <w:r>
+              <w:rPr>
+                <w:rFonts w:ascii="Times New Roman" w:hAnsi="Times New Roman" w:eastAsia="Times New Roman"/>
+                <w:b w:val="0"/>
+                <w:i w:val="0"/>
+                <w:color w:val="000000"/>
+                <w:sz w:val="19"/>
+              </w:rPr>
+              <w:t>F1</w:t>
+            </w:r>
+          </w:p>
+        </w:tc>
+        <w:tc>
+          <w:tcPr>
+            <w:tcW w:type="dxa" w:w="1584"/>
+          </w:tcPr>
+          <w:p>
+            <w:r>
+              <w:rPr>
+                <w:rFonts w:ascii="Times New Roman" w:hAnsi="Times New Roman" w:eastAsia="Times New Roman"/>
+                <w:b w:val="0"/>
+                <w:i w:val="0"/>
+                <w:color w:val="000000"/>
+                <w:sz w:val="19"/>
+              </w:rPr>
+              <w:t>0.7126</w:t>
+            </w:r>
+          </w:p>
+        </w:tc>
+        <w:tc>
+          <w:tcPr>
+            <w:tcW w:type="dxa" w:w="1584"/>
+          </w:tcPr>
+          <w:p>
+            <w:r>
+              <w:rPr>
+                <w:rFonts w:ascii="Times New Roman" w:hAnsi="Times New Roman" w:eastAsia="Times New Roman"/>
+                <w:b w:val="0"/>
+                <w:i w:val="0"/>
+                <w:color w:val="000000"/>
+                <w:sz w:val="19"/>
+              </w:rPr>
+              <w:t>0.8060</w:t>
+            </w:r>
+          </w:p>
+        </w:tc>
+        <w:tc>
+          <w:tcPr>
+            <w:tcW w:type="dxa" w:w="1872"/>
+          </w:tcPr>
+          <w:p>
+            <w:r>
+              <w:rPr>
+                <w:rFonts w:ascii="Times New Roman" w:hAnsi="Times New Roman" w:eastAsia="Times New Roman"/>
+                <w:b w:val="0"/>
+                <w:i w:val="0"/>
+                <w:color w:val="000000"/>
+                <w:sz w:val="19"/>
+              </w:rPr>
+              <w:t>+0.093</w:t>
+            </w:r>
+          </w:p>
+        </w:tc>
+      </w:tr>
+      <w:tr>
+        <w:tc>
+          <w:tcPr>
+            <w:tcW w:type="dxa" w:w="1584"/>
+          </w:tcPr>
+          <w:p>
+            <w:r>
+              <w:rPr>
+                <w:rFonts w:ascii="Times New Roman" w:hAnsi="Times New Roman" w:eastAsia="Times New Roman"/>
+                <w:b w:val="0"/>
+                <w:i w:val="0"/>
+                <w:color w:val="000000"/>
+                <w:sz w:val="19"/>
+              </w:rPr>
+              <w:t>mBRSET</w:t>
+            </w:r>
+          </w:p>
+        </w:tc>
+        <w:tc>
+          <w:tcPr>
+            <w:tcW w:type="dxa" w:w="1152"/>
+          </w:tcPr>
+          <w:p>
+            <w:r>
+              <w:rPr>
+                <w:rFonts w:ascii="Times New Roman" w:hAnsi="Times New Roman" w:eastAsia="Times New Roman"/>
+                <w:b w:val="0"/>
+                <w:i w:val="0"/>
+                <w:color w:val="000000"/>
+                <w:sz w:val="19"/>
+              </w:rPr>
+              <w:t>ME</w:t>
+            </w:r>
+          </w:p>
+        </w:tc>
+        <w:tc>
+          <w:tcPr>
+            <w:tcW w:type="dxa" w:w="1440"/>
+          </w:tcPr>
+          <w:p>
+            <w:r>
+              <w:rPr>
+                <w:rFonts w:ascii="Times New Roman" w:hAnsi="Times New Roman" w:eastAsia="Times New Roman"/>
+                <w:b w:val="0"/>
+                <w:i w:val="0"/>
+                <w:color w:val="000000"/>
+                <w:sz w:val="19"/>
+              </w:rPr>
+              <w:t>Recall</w:t>
+            </w:r>
+          </w:p>
+        </w:tc>
+        <w:tc>
+          <w:tcPr>
+            <w:tcW w:type="dxa" w:w="1584"/>
+          </w:tcPr>
+          <w:p>
+            <w:r>
+              <w:rPr>
+                <w:rFonts w:ascii="Times New Roman" w:hAnsi="Times New Roman" w:eastAsia="Times New Roman"/>
+                <w:b w:val="0"/>
+                <w:i w:val="0"/>
+                <w:color w:val="000000"/>
+                <w:sz w:val="19"/>
+              </w:rPr>
+              <w:t>0.5560</w:t>
+            </w:r>
+          </w:p>
+        </w:tc>
+        <w:tc>
+          <w:tcPr>
+            <w:tcW w:type="dxa" w:w="1584"/>
+          </w:tcPr>
+          <w:p>
+            <w:r>
+              <w:rPr>
+                <w:rFonts w:ascii="Times New Roman" w:hAnsi="Times New Roman" w:eastAsia="Times New Roman"/>
+                <w:b w:val="0"/>
+                <w:i w:val="0"/>
+                <w:color w:val="000000"/>
+                <w:sz w:val="19"/>
+              </w:rPr>
+              <w:t>0.7308</w:t>
+            </w:r>
+          </w:p>
+        </w:tc>
+        <w:tc>
+          <w:tcPr>
+            <w:tcW w:type="dxa" w:w="1872"/>
+          </w:tcPr>
+          <w:p>
+            <w:r>
+              <w:rPr>
+                <w:rFonts w:ascii="Times New Roman" w:hAnsi="Times New Roman" w:eastAsia="Times New Roman"/>
+                <w:b w:val="0"/>
+                <w:i w:val="0"/>
+                <w:color w:val="000000"/>
+                <w:sz w:val="19"/>
+              </w:rPr>
+              <w:t>+0.175</w:t>
+            </w:r>
+          </w:p>
+        </w:tc>
+      </w:tr>
+    </w:tbl>
+    <w:p>
+      <w:pPr>
+        <w:spacing w:after="60"/>
+      </w:pPr>
+    </w:p>
+    <w:p>
+      <w:pPr>
+        <w:spacing w:after="120"/>
+      </w:pPr>
+      <w:r>
+        <w:rPr>
+          <w:rFonts w:ascii="Times New Roman" w:hAnsi="Times New Roman" w:eastAsia="Times New Roman"/>
+          <w:b w:val="0"/>
+          <w:i w:val="0"/>
+          <w:color w:val="000000"/>
+          <w:sz w:val="21"/>
+        </w:rPr>
+        <w:t>mBRSET improved cleanly on every metric for both labels - this is now the best mBRSET model outright. BRSET is more mixed: diabetic_retinopathy improved, but macular_edema's raw test F1 dropped even as its train-test gap also shrank. Most likely explanation: BRSET's larger training set (11,372 vs. mBRSET's 3,402 images) meant it had less overfitting to fix to begin with, so the same regularization strength that clearly helped mBRSET was probably too strong for BRSET's already-thin macular_edema signal (only 274 training positives).</w:t>
+      </w:r>
+    </w:p>
+    <w:p>
+      <w:pPr>
+        <w:jc w:val="center"/>
+      </w:pPr>
+      <w:r>
+        <w:drawing>
+          <wp:inline xmlns:a="http://schemas.openxmlformats.org/drawingml/2006/main" xmlns:pic="http://schemas.openxmlformats.org/drawingml/2006/picture">
+            <wp:extent cx="5120640" cy="3200400"/>
+            <wp:docPr id="5" name="Picture 5"/>
+            <wp:cNvGraphicFramePr>
+              <a:graphicFrameLocks noChangeAspect="1"/>
+            </wp:cNvGraphicFramePr>
+            <a:graphic>
+              <a:graphicData uri="http://schemas.openxmlformats.org/drawingml/2006/picture">
+                <pic:pic>
+                  <pic:nvPicPr>
+                    <pic:cNvPr id="0" name="training_curve.jpg"/>
+                    <pic:cNvPicPr/>
+                  </pic:nvPicPr>
+                  <pic:blipFill>
+                    <a:blip r:embed="rId13"/>
+                    <a:stretch>
+                      <a:fillRect/>
+                    </a:stretch>
+                  </pic:blipFill>
+                  <pic:spPr>
+                    <a:xfrm>
+                      <a:off x="0" y="0"/>
+                      <a:ext cx="5120640" cy="3200400"/>
+                    </a:xfrm>
+                    <a:prstGeom prst="rect"/>
+                  </pic:spPr>
+                </pic:pic>
+              </a:graphicData>
+            </a:graphic>
+          </wp:inline>
+        </w:drawing>
+      </w:r>
+    </w:p>
+    <w:p>
+      <w:pPr>
+        <w:jc w:val="center"/>
+      </w:pPr>
+      <w:r>
+        <w:rPr>
+          <w:rFonts w:ascii="Times New Roman" w:hAnsi="Times New Roman" w:eastAsia="Times New Roman"/>
+          <w:b w:val="0"/>
+          <w:i/>
+          <w:color w:val="000000"/>
+          <w:sz w:val="18"/>
+        </w:rPr>
+        <w:t>Figure 5. BRSET regularized validation curve (best epoch 2).</w:t>
+      </w:r>
+    </w:p>
+    <w:p>
+      <w:pPr>
+        <w:jc w:val="center"/>
+      </w:pPr>
+      <w:r>
+        <w:drawing>
+          <wp:inline xmlns:a="http://schemas.openxmlformats.org/drawingml/2006/main" xmlns:pic="http://schemas.openxmlformats.org/drawingml/2006/picture">
+            <wp:extent cx="5120640" cy="3200400"/>
+            <wp:docPr id="6" name="Picture 6"/>
+            <wp:cNvGraphicFramePr>
+              <a:graphicFrameLocks noChangeAspect="1"/>
+            </wp:cNvGraphicFramePr>
+            <a:graphic>
+              <a:graphicData uri="http://schemas.openxmlformats.org/drawingml/2006/picture">
+                <pic:pic>
+                  <pic:nvPicPr>
+                    <pic:cNvPr id="0" name="training_curve.jpg"/>
+                    <pic:cNvPicPr/>
+                  </pic:nvPicPr>
+                  <pic:blipFill>
+                    <a:blip r:embed="rId14"/>
+                    <a:stretch>
+                      <a:fillRect/>
+                    </a:stretch>
+                  </pic:blipFill>
+                  <pic:spPr>
+                    <a:xfrm>
+                      <a:off x="0" y="0"/>
+                      <a:ext cx="5120640" cy="3200400"/>
+                    </a:xfrm>
+                    <a:prstGeom prst="rect"/>
+                  </pic:spPr>
+                </pic:pic>
+              </a:graphicData>
+            </a:graphic>
+          </wp:inline>
+        </w:drawing>
+      </w:r>
+    </w:p>
+    <w:p>
+      <w:pPr>
+        <w:jc w:val="center"/>
+      </w:pPr>
+      <w:r>
+        <w:rPr>
+          <w:rFonts w:ascii="Times New Roman" w:hAnsi="Times New Roman" w:eastAsia="Times New Roman"/>
+          <w:b w:val="0"/>
+          <w:i/>
+          <w:color w:val="000000"/>
+          <w:sz w:val="18"/>
+        </w:rPr>
+        <w:t>Figure 6. mBRSET regularized validation curve (best epoch 6).</w:t>
+      </w:r>
+    </w:p>
+    <w:p>
+      <w:r>
+        <w:br w:type="page"/>
+      </w:r>
+    </w:p>
+    <w:p>
+      <w:pPr>
+        <w:spacing w:before="240" w:after="100"/>
+      </w:pPr>
+      <w:r>
+        <w:rPr>
+          <w:rFonts w:ascii="Times New Roman" w:hAnsi="Times New Roman" w:eastAsia="Times New Roman"/>
+          <w:b/>
+          <w:i w:val="0"/>
+          <w:color w:val="000000"/>
+          <w:sz w:val="28"/>
+        </w:rPr>
+        <w:t>7. Ensembling (Original + Regularized) - Final Best Models</w:t>
+      </w:r>
+    </w:p>
+    <w:p>
+      <w:pPr>
+        <w:spacing w:after="120"/>
+      </w:pPr>
+      <w:r>
+        <w:rPr>
+          <w:rFonts w:ascii="Times New Roman" w:hAnsi="Times New Roman" w:eastAsia="Times New Roman"/>
+          <w:b w:val="0"/>
+          <w:i w:val="0"/>
+          <w:color w:val="000000"/>
+          <w:sz w:val="22"/>
+        </w:rPr>
+        <w:t>Rather than run a third, dataset-specific regularization-tuning experiment to fix BRSET's macular_edema tradeoff, the original and regularized checkpoints were ensembled by averaging their predicted probabilities - no new training, using checkpoints already on hand.</w:t>
+      </w:r>
+    </w:p>
+    <w:tbl>
+      <w:tblPr>
+        <w:tblStyle w:val="TableGrid"/>
+        <w:tblW w:type="auto" w:w="0"/>
+        <w:jc w:val="center"/>
+        <w:tblLook w:firstColumn="1" w:firstRow="1" w:lastColumn="0" w:lastRow="0" w:noHBand="0" w:noVBand="1" w:val="04A0"/>
+      </w:tblPr>
+      <w:tblGrid>
+        <w:gridCol w:w="1560"/>
+        <w:gridCol w:w="1560"/>
+        <w:gridCol w:w="1560"/>
+        <w:gridCol w:w="1560"/>
+        <w:gridCol w:w="1560"/>
+        <w:gridCol w:w="1560"/>
+      </w:tblGrid>
+      <w:tr>
+        <w:tc>
+          <w:tcPr>
+            <w:tcW w:type="dxa" w:w="1440"/>
+          </w:tcPr>
+          <w:p>
+            <w:r>
+              <w:rPr>
+                <w:rFonts w:ascii="Times New Roman" w:hAnsi="Times New Roman" w:eastAsia="Times New Roman"/>
+                <w:b/>
+                <w:i w:val="0"/>
+                <w:color w:val="000000"/>
+                <w:sz w:val="19"/>
+              </w:rPr>
+              <w:t>Dataset</w:t>
+            </w:r>
+          </w:p>
+        </w:tc>
+        <w:tc>
+          <w:tcPr>
+            <w:tcW w:type="dxa" w:w="864"/>
+          </w:tcPr>
+          <w:p>
+            <w:r>
+              <w:rPr>
+                <w:rFonts w:ascii="Times New Roman" w:hAnsi="Times New Roman" w:eastAsia="Times New Roman"/>
+                <w:b/>
+                <w:i w:val="0"/>
+                <w:color w:val="000000"/>
+                <w:sz w:val="19"/>
+              </w:rPr>
+              <w:t>Label</w:t>
+            </w:r>
+          </w:p>
+        </w:tc>
+        <w:tc>
+          <w:tcPr>
+            <w:tcW w:type="dxa" w:w="1152"/>
+          </w:tcPr>
+          <w:p>
+            <w:r>
+              <w:rPr>
+                <w:rFonts w:ascii="Times New Roman" w:hAnsi="Times New Roman" w:eastAsia="Times New Roman"/>
+                <w:b/>
+                <w:i w:val="0"/>
+                <w:color w:val="000000"/>
+                <w:sz w:val="19"/>
+              </w:rPr>
+              <w:t>Metric</w:t>
+            </w:r>
+          </w:p>
+        </w:tc>
+        <w:tc>
+          <w:tcPr>
+            <w:tcW w:type="dxa" w:w="1584"/>
+          </w:tcPr>
+          <w:p>
+            <w:r>
+              <w:rPr>
+                <w:rFonts w:ascii="Times New Roman" w:hAnsi="Times New Roman" w:eastAsia="Times New Roman"/>
+                <w:b/>
+                <w:i w:val="0"/>
+                <w:color w:val="000000"/>
+                <w:sz w:val="19"/>
+              </w:rPr>
+              <w:t>Original</w:t>
+            </w:r>
+          </w:p>
+        </w:tc>
+        <w:tc>
+          <w:tcPr>
+            <w:tcW w:type="dxa" w:w="1872"/>
+          </w:tcPr>
+          <w:p>
+            <w:r>
+              <w:rPr>
+                <w:rFonts w:ascii="Times New Roman" w:hAnsi="Times New Roman" w:eastAsia="Times New Roman"/>
+                <w:b/>
+                <w:i w:val="0"/>
+                <w:color w:val="000000"/>
+                <w:sz w:val="19"/>
+              </w:rPr>
+              <w:t>Regularized</w:t>
+            </w:r>
+          </w:p>
+        </w:tc>
+        <w:tc>
+          <w:tcPr>
+            <w:tcW w:type="dxa" w:w="1584"/>
+          </w:tcPr>
+          <w:p>
+            <w:r>
+              <w:rPr>
+                <w:rFonts w:ascii="Times New Roman" w:hAnsi="Times New Roman" w:eastAsia="Times New Roman"/>
+                <w:b/>
+                <w:i w:val="0"/>
+                <w:color w:val="000000"/>
+                <w:sz w:val="19"/>
+              </w:rPr>
+              <w:t>Ensemble</w:t>
+            </w:r>
+          </w:p>
+        </w:tc>
+      </w:tr>
+      <w:tr>
+        <w:tc>
+          <w:tcPr>
+            <w:tcW w:type="dxa" w:w="1440"/>
+          </w:tcPr>
+          <w:p>
+            <w:r>
+              <w:rPr>
+                <w:rFonts w:ascii="Times New Roman" w:hAnsi="Times New Roman" w:eastAsia="Times New Roman"/>
+                <w:b w:val="0"/>
+                <w:i w:val="0"/>
+                <w:color w:val="000000"/>
+                <w:sz w:val="19"/>
+              </w:rPr>
+              <w:t>BRSET</w:t>
+            </w:r>
+          </w:p>
+        </w:tc>
+        <w:tc>
+          <w:tcPr>
+            <w:tcW w:type="dxa" w:w="864"/>
+          </w:tcPr>
+          <w:p>
+            <w:r>
+              <w:rPr>
+                <w:rFonts w:ascii="Times New Roman" w:hAnsi="Times New Roman" w:eastAsia="Times New Roman"/>
+                <w:b w:val="0"/>
+                <w:i w:val="0"/>
+                <w:color w:val="000000"/>
+                <w:sz w:val="19"/>
+              </w:rPr>
+              <w:t>DR</w:t>
+            </w:r>
+          </w:p>
+        </w:tc>
+        <w:tc>
+          <w:tcPr>
+            <w:tcW w:type="dxa" w:w="1152"/>
+          </w:tcPr>
+          <w:p>
+            <w:r>
+              <w:rPr>
+                <w:rFonts w:ascii="Times New Roman" w:hAnsi="Times New Roman" w:eastAsia="Times New Roman"/>
+                <w:b w:val="0"/>
+                <w:i w:val="0"/>
+                <w:color w:val="000000"/>
+                <w:sz w:val="19"/>
+              </w:rPr>
+              <w:t>F1</w:t>
+            </w:r>
+          </w:p>
+        </w:tc>
+        <w:tc>
+          <w:tcPr>
+            <w:tcW w:type="dxa" w:w="1584"/>
+          </w:tcPr>
+          <w:p>
+            <w:r>
+              <w:rPr>
+                <w:rFonts w:ascii="Times New Roman" w:hAnsi="Times New Roman" w:eastAsia="Times New Roman"/>
+                <w:b w:val="0"/>
+                <w:i w:val="0"/>
+                <w:color w:val="000000"/>
+                <w:sz w:val="19"/>
+              </w:rPr>
+              <w:t>0.8445</w:t>
+            </w:r>
+          </w:p>
+        </w:tc>
+        <w:tc>
+          <w:tcPr>
+            <w:tcW w:type="dxa" w:w="1872"/>
+          </w:tcPr>
+          <w:p>
+            <w:r>
+              <w:rPr>
+                <w:rFonts w:ascii="Times New Roman" w:hAnsi="Times New Roman" w:eastAsia="Times New Roman"/>
+                <w:b w:val="0"/>
+                <w:i w:val="0"/>
+                <w:color w:val="000000"/>
+                <w:sz w:val="19"/>
+              </w:rPr>
+              <w:t>0.8609</w:t>
+            </w:r>
+          </w:p>
+        </w:tc>
+        <w:tc>
+          <w:tcPr>
+            <w:tcW w:type="dxa" w:w="1584"/>
+          </w:tcPr>
+          <w:p>
+            <w:r>
+              <w:rPr>
+                <w:rFonts w:ascii="Times New Roman" w:hAnsi="Times New Roman" w:eastAsia="Times New Roman"/>
+                <w:b w:val="0"/>
+                <w:i w:val="0"/>
+                <w:color w:val="000000"/>
+                <w:sz w:val="19"/>
+              </w:rPr>
+              <w:t>0.8676</w:t>
+            </w:r>
+          </w:p>
+        </w:tc>
+      </w:tr>
+      <w:tr>
+        <w:tc>
+          <w:tcPr>
+            <w:tcW w:type="dxa" w:w="1440"/>
+          </w:tcPr>
+          <w:p>
+            <w:r>
+              <w:rPr>
+                <w:rFonts w:ascii="Times New Roman" w:hAnsi="Times New Roman" w:eastAsia="Times New Roman"/>
+                <w:b w:val="0"/>
+                <w:i w:val="0"/>
+                <w:color w:val="000000"/>
+                <w:sz w:val="19"/>
+              </w:rPr>
+              <w:t>BRSET</w:t>
+            </w:r>
+          </w:p>
+        </w:tc>
+        <w:tc>
+          <w:tcPr>
+            <w:tcW w:type="dxa" w:w="864"/>
+          </w:tcPr>
+          <w:p>
+            <w:r>
+              <w:rPr>
+                <w:rFonts w:ascii="Times New Roman" w:hAnsi="Times New Roman" w:eastAsia="Times New Roman"/>
+                <w:b w:val="0"/>
+                <w:i w:val="0"/>
+                <w:color w:val="000000"/>
+                <w:sz w:val="19"/>
+              </w:rPr>
+              <w:t>DR</w:t>
+            </w:r>
+          </w:p>
+        </w:tc>
+        <w:tc>
+          <w:tcPr>
+            <w:tcW w:type="dxa" w:w="1152"/>
+          </w:tcPr>
+          <w:p>
+            <w:r>
+              <w:rPr>
+                <w:rFonts w:ascii="Times New Roman" w:hAnsi="Times New Roman" w:eastAsia="Times New Roman"/>
+                <w:b w:val="0"/>
+                <w:i w:val="0"/>
+                <w:color w:val="000000"/>
+                <w:sz w:val="19"/>
+              </w:rPr>
+              <w:t>AUC</w:t>
+            </w:r>
+          </w:p>
+        </w:tc>
+        <w:tc>
+          <w:tcPr>
+            <w:tcW w:type="dxa" w:w="1584"/>
+          </w:tcPr>
+          <w:p>
+            <w:r>
+              <w:rPr>
+                <w:rFonts w:ascii="Times New Roman" w:hAnsi="Times New Roman" w:eastAsia="Times New Roman"/>
+                <w:b w:val="0"/>
+                <w:i w:val="0"/>
+                <w:color w:val="000000"/>
+                <w:sz w:val="19"/>
+              </w:rPr>
+              <w:t>0.9872</w:t>
+            </w:r>
+          </w:p>
+        </w:tc>
+        <w:tc>
+          <w:tcPr>
+            <w:tcW w:type="dxa" w:w="1872"/>
+          </w:tcPr>
+          <w:p>
+            <w:r>
+              <w:rPr>
+                <w:rFonts w:ascii="Times New Roman" w:hAnsi="Times New Roman" w:eastAsia="Times New Roman"/>
+                <w:b w:val="0"/>
+                <w:i w:val="0"/>
+                <w:color w:val="000000"/>
+                <w:sz w:val="19"/>
+              </w:rPr>
+              <w:t>0.9876</w:t>
+            </w:r>
+          </w:p>
+        </w:tc>
+        <w:tc>
+          <w:tcPr>
+            <w:tcW w:type="dxa" w:w="1584"/>
+          </w:tcPr>
+          <w:p>
+            <w:r>
+              <w:rPr>
+                <w:rFonts w:ascii="Times New Roman" w:hAnsi="Times New Roman" w:eastAsia="Times New Roman"/>
+                <w:b w:val="0"/>
+                <w:i w:val="0"/>
+                <w:color w:val="000000"/>
+                <w:sz w:val="19"/>
+              </w:rPr>
+              <w:t>0.9878</w:t>
+            </w:r>
+          </w:p>
+        </w:tc>
+      </w:tr>
+      <w:tr>
+        <w:tc>
+          <w:tcPr>
+            <w:tcW w:type="dxa" w:w="1440"/>
+          </w:tcPr>
+          <w:p>
+            <w:r>
+              <w:rPr>
+                <w:rFonts w:ascii="Times New Roman" w:hAnsi="Times New Roman" w:eastAsia="Times New Roman"/>
+                <w:b w:val="0"/>
+                <w:i w:val="0"/>
+                <w:color w:val="000000"/>
+                <w:sz w:val="19"/>
+              </w:rPr>
+              <w:t>BRSET</w:t>
+            </w:r>
+          </w:p>
+        </w:tc>
+        <w:tc>
+          <w:tcPr>
+            <w:tcW w:type="dxa" w:w="864"/>
+          </w:tcPr>
+          <w:p>
+            <w:r>
+              <w:rPr>
+                <w:rFonts w:ascii="Times New Roman" w:hAnsi="Times New Roman" w:eastAsia="Times New Roman"/>
+                <w:b w:val="0"/>
+                <w:i w:val="0"/>
+                <w:color w:val="000000"/>
+                <w:sz w:val="19"/>
+              </w:rPr>
+              <w:t>ME</w:t>
+            </w:r>
+          </w:p>
+        </w:tc>
+        <w:tc>
+          <w:tcPr>
+            <w:tcW w:type="dxa" w:w="1152"/>
+          </w:tcPr>
+          <w:p>
+            <w:r>
+              <w:rPr>
+                <w:rFonts w:ascii="Times New Roman" w:hAnsi="Times New Roman" w:eastAsia="Times New Roman"/>
+                <w:b w:val="0"/>
+                <w:i w:val="0"/>
+                <w:color w:val="000000"/>
+                <w:sz w:val="19"/>
+              </w:rPr>
+              <w:t>F1</w:t>
+            </w:r>
+          </w:p>
+        </w:tc>
+        <w:tc>
+          <w:tcPr>
+            <w:tcW w:type="dxa" w:w="1584"/>
+          </w:tcPr>
+          <w:p>
+            <w:r>
+              <w:rPr>
+                <w:rFonts w:ascii="Times New Roman" w:hAnsi="Times New Roman" w:eastAsia="Times New Roman"/>
+                <w:b w:val="0"/>
+                <w:i w:val="0"/>
+                <w:color w:val="000000"/>
+                <w:sz w:val="19"/>
+              </w:rPr>
+              <w:t>0.7850</w:t>
+            </w:r>
+          </w:p>
+        </w:tc>
+        <w:tc>
+          <w:tcPr>
+            <w:tcW w:type="dxa" w:w="1872"/>
+          </w:tcPr>
+          <w:p>
+            <w:r>
+              <w:rPr>
+                <w:rFonts w:ascii="Times New Roman" w:hAnsi="Times New Roman" w:eastAsia="Times New Roman"/>
+                <w:b w:val="0"/>
+                <w:i w:val="0"/>
+                <w:color w:val="000000"/>
+                <w:sz w:val="19"/>
+              </w:rPr>
+              <w:t>0.7449</w:t>
+            </w:r>
+          </w:p>
+        </w:tc>
+        <w:tc>
+          <w:tcPr>
+            <w:tcW w:type="dxa" w:w="1584"/>
+          </w:tcPr>
+          <w:p>
+            <w:r>
+              <w:rPr>
+                <w:rFonts w:ascii="Times New Roman" w:hAnsi="Times New Roman" w:eastAsia="Times New Roman"/>
+                <w:b w:val="0"/>
+                <w:i w:val="0"/>
+                <w:color w:val="000000"/>
+                <w:sz w:val="19"/>
+              </w:rPr>
+              <w:t>0.7883</w:t>
+            </w:r>
+          </w:p>
+        </w:tc>
+      </w:tr>
+      <w:tr>
+        <w:tc>
+          <w:tcPr>
+            <w:tcW w:type="dxa" w:w="1440"/>
+          </w:tcPr>
+          <w:p>
+            <w:r>
+              <w:rPr>
+                <w:rFonts w:ascii="Times New Roman" w:hAnsi="Times New Roman" w:eastAsia="Times New Roman"/>
+                <w:b w:val="0"/>
+                <w:i w:val="0"/>
+                <w:color w:val="000000"/>
+                <w:sz w:val="19"/>
+              </w:rPr>
+              <w:t>BRSET</w:t>
+            </w:r>
+          </w:p>
+        </w:tc>
+        <w:tc>
+          <w:tcPr>
+            <w:tcW w:type="dxa" w:w="864"/>
+          </w:tcPr>
+          <w:p>
+            <w:r>
+              <w:rPr>
+                <w:rFonts w:ascii="Times New Roman" w:hAnsi="Times New Roman" w:eastAsia="Times New Roman"/>
+                <w:b w:val="0"/>
+                <w:i w:val="0"/>
+                <w:color w:val="000000"/>
+                <w:sz w:val="19"/>
+              </w:rPr>
+              <w:t>ME</w:t>
+            </w:r>
+          </w:p>
+        </w:tc>
+        <w:tc>
+          <w:tcPr>
+            <w:tcW w:type="dxa" w:w="1152"/>
+          </w:tcPr>
+          <w:p>
+            <w:r>
+              <w:rPr>
+                <w:rFonts w:ascii="Times New Roman" w:hAnsi="Times New Roman" w:eastAsia="Times New Roman"/>
+                <w:b w:val="0"/>
+                <w:i w:val="0"/>
+                <w:color w:val="000000"/>
+                <w:sz w:val="19"/>
+              </w:rPr>
+              <w:t>AUC</w:t>
+            </w:r>
+          </w:p>
+        </w:tc>
+        <w:tc>
+          <w:tcPr>
+            <w:tcW w:type="dxa" w:w="1584"/>
+          </w:tcPr>
+          <w:p>
+            <w:r>
+              <w:rPr>
+                <w:rFonts w:ascii="Times New Roman" w:hAnsi="Times New Roman" w:eastAsia="Times New Roman"/>
+                <w:b w:val="0"/>
+                <w:i w:val="0"/>
+                <w:color w:val="000000"/>
+                <w:sz w:val="19"/>
+              </w:rPr>
+              <w:t>0.9925</w:t>
+            </w:r>
+          </w:p>
+        </w:tc>
+        <w:tc>
+          <w:tcPr>
+            <w:tcW w:type="dxa" w:w="1872"/>
+          </w:tcPr>
+          <w:p>
+            <w:r>
+              <w:rPr>
+                <w:rFonts w:ascii="Times New Roman" w:hAnsi="Times New Roman" w:eastAsia="Times New Roman"/>
+                <w:b w:val="0"/>
+                <w:i w:val="0"/>
+                <w:color w:val="000000"/>
+                <w:sz w:val="19"/>
+              </w:rPr>
+              <w:t>0.9861</w:t>
+            </w:r>
+          </w:p>
+        </w:tc>
+        <w:tc>
+          <w:tcPr>
+            <w:tcW w:type="dxa" w:w="1584"/>
+          </w:tcPr>
+          <w:p>
+            <w:r>
+              <w:rPr>
+                <w:rFonts w:ascii="Times New Roman" w:hAnsi="Times New Roman" w:eastAsia="Times New Roman"/>
+                <w:b w:val="0"/>
+                <w:i w:val="0"/>
+                <w:color w:val="000000"/>
+                <w:sz w:val="19"/>
+              </w:rPr>
+              <w:t>0.9935</w:t>
+            </w:r>
+          </w:p>
+        </w:tc>
+      </w:tr>
+      <w:tr>
+        <w:tc>
+          <w:tcPr>
+            <w:tcW w:type="dxa" w:w="1440"/>
+          </w:tcPr>
+          <w:p>
+            <w:r>
+              <w:rPr>
+                <w:rFonts w:ascii="Times New Roman" w:hAnsi="Times New Roman" w:eastAsia="Times New Roman"/>
+                <w:b w:val="0"/>
+                <w:i w:val="0"/>
+                <w:color w:val="000000"/>
+                <w:sz w:val="19"/>
+              </w:rPr>
+              <w:t>mBRSET</w:t>
+            </w:r>
+          </w:p>
+        </w:tc>
+        <w:tc>
+          <w:tcPr>
+            <w:tcW w:type="dxa" w:w="864"/>
+          </w:tcPr>
+          <w:p>
+            <w:r>
+              <w:rPr>
+                <w:rFonts w:ascii="Times New Roman" w:hAnsi="Times New Roman" w:eastAsia="Times New Roman"/>
+                <w:b w:val="0"/>
+                <w:i w:val="0"/>
+                <w:color w:val="000000"/>
+                <w:sz w:val="19"/>
+              </w:rPr>
+              <w:t>DR</w:t>
+            </w:r>
+          </w:p>
+        </w:tc>
+        <w:tc>
+          <w:tcPr>
+            <w:tcW w:type="dxa" w:w="1152"/>
+          </w:tcPr>
+          <w:p>
+            <w:r>
+              <w:rPr>
+                <w:rFonts w:ascii="Times New Roman" w:hAnsi="Times New Roman" w:eastAsia="Times New Roman"/>
+                <w:b w:val="0"/>
+                <w:i w:val="0"/>
+                <w:color w:val="000000"/>
+                <w:sz w:val="19"/>
+              </w:rPr>
+              <w:t>F1</w:t>
+            </w:r>
+          </w:p>
+        </w:tc>
+        <w:tc>
+          <w:tcPr>
+            <w:tcW w:type="dxa" w:w="1584"/>
+          </w:tcPr>
+          <w:p>
+            <w:r>
+              <w:rPr>
+                <w:rFonts w:ascii="Times New Roman" w:hAnsi="Times New Roman" w:eastAsia="Times New Roman"/>
+                <w:b w:val="0"/>
+                <w:i w:val="0"/>
+                <w:color w:val="000000"/>
+                <w:sz w:val="19"/>
+              </w:rPr>
+              <w:t>0.7939</w:t>
+            </w:r>
+          </w:p>
+        </w:tc>
+        <w:tc>
+          <w:tcPr>
+            <w:tcW w:type="dxa" w:w="1872"/>
+          </w:tcPr>
+          <w:p>
+            <w:r>
+              <w:rPr>
+                <w:rFonts w:ascii="Times New Roman" w:hAnsi="Times New Roman" w:eastAsia="Times New Roman"/>
+                <w:b w:val="0"/>
+                <w:i w:val="0"/>
+                <w:color w:val="000000"/>
+                <w:sz w:val="19"/>
+              </w:rPr>
+              <w:t>0.8137</w:t>
+            </w:r>
+          </w:p>
+        </w:tc>
+        <w:tc>
+          <w:tcPr>
+            <w:tcW w:type="dxa" w:w="1584"/>
+          </w:tcPr>
+          <w:p>
+            <w:r>
+              <w:rPr>
+                <w:rFonts w:ascii="Times New Roman" w:hAnsi="Times New Roman" w:eastAsia="Times New Roman"/>
+                <w:b w:val="0"/>
+                <w:i w:val="0"/>
+                <w:color w:val="000000"/>
+                <w:sz w:val="19"/>
+              </w:rPr>
+              <w:t>0.7916</w:t>
+            </w:r>
+          </w:p>
+        </w:tc>
+      </w:tr>
+      <w:tr>
+        <w:tc>
+          <w:tcPr>
+            <w:tcW w:type="dxa" w:w="1440"/>
+          </w:tcPr>
+          <w:p>
+            <w:r>
+              <w:rPr>
+                <w:rFonts w:ascii="Times New Roman" w:hAnsi="Times New Roman" w:eastAsia="Times New Roman"/>
+                <w:b w:val="0"/>
+                <w:i w:val="0"/>
+                <w:color w:val="000000"/>
+                <w:sz w:val="19"/>
+              </w:rPr>
+              <w:t>mBRSET</w:t>
+            </w:r>
+          </w:p>
+        </w:tc>
+        <w:tc>
+          <w:tcPr>
+            <w:tcW w:type="dxa" w:w="864"/>
+          </w:tcPr>
+          <w:p>
+            <w:r>
+              <w:rPr>
+                <w:rFonts w:ascii="Times New Roman" w:hAnsi="Times New Roman" w:eastAsia="Times New Roman"/>
+                <w:b w:val="0"/>
+                <w:i w:val="0"/>
+                <w:color w:val="000000"/>
+                <w:sz w:val="19"/>
+              </w:rPr>
+              <w:t>ME</w:t>
+            </w:r>
+          </w:p>
+        </w:tc>
+        <w:tc>
+          <w:tcPr>
+            <w:tcW w:type="dxa" w:w="1152"/>
+          </w:tcPr>
+          <w:p>
+            <w:r>
+              <w:rPr>
+                <w:rFonts w:ascii="Times New Roman" w:hAnsi="Times New Roman" w:eastAsia="Times New Roman"/>
+                <w:b w:val="0"/>
+                <w:i w:val="0"/>
+                <w:color w:val="000000"/>
+                <w:sz w:val="19"/>
+              </w:rPr>
+              <w:t>F1</w:t>
+            </w:r>
+          </w:p>
+        </w:tc>
+        <w:tc>
+          <w:tcPr>
+            <w:tcW w:type="dxa" w:w="1584"/>
+          </w:tcPr>
+          <w:p>
+            <w:r>
+              <w:rPr>
+                <w:rFonts w:ascii="Times New Roman" w:hAnsi="Times New Roman" w:eastAsia="Times New Roman"/>
+                <w:b w:val="0"/>
+                <w:i w:val="0"/>
+                <w:color w:val="000000"/>
+                <w:sz w:val="19"/>
+              </w:rPr>
+              <w:t>0.7126</w:t>
+            </w:r>
+          </w:p>
+        </w:tc>
+        <w:tc>
+          <w:tcPr>
+            <w:tcW w:type="dxa" w:w="1872"/>
+          </w:tcPr>
+          <w:p>
+            <w:r>
+              <w:rPr>
+                <w:rFonts w:ascii="Times New Roman" w:hAnsi="Times New Roman" w:eastAsia="Times New Roman"/>
+                <w:b w:val="0"/>
+                <w:i w:val="0"/>
+                <w:color w:val="000000"/>
+                <w:sz w:val="19"/>
+              </w:rPr>
+              <w:t>0.8060</w:t>
+            </w:r>
+          </w:p>
+        </w:tc>
+        <w:tc>
+          <w:tcPr>
+            <w:tcW w:type="dxa" w:w="1584"/>
+          </w:tcPr>
+          <w:p>
+            <w:r>
+              <w:rPr>
+                <w:rFonts w:ascii="Times New Roman" w:hAnsi="Times New Roman" w:eastAsia="Times New Roman"/>
+                <w:b w:val="0"/>
+                <w:i w:val="0"/>
+                <w:color w:val="000000"/>
+                <w:sz w:val="19"/>
+              </w:rPr>
+              <w:t>0.7748</w:t>
+            </w:r>
+          </w:p>
+        </w:tc>
+      </w:tr>
+    </w:tbl>
+    <w:p>
+      <w:pPr>
+        <w:spacing w:after="60"/>
+      </w:pPr>
+    </w:p>
+    <w:p>
+      <w:pPr>
+        <w:spacing w:after="120"/>
+      </w:pPr>
+      <w:r>
+        <w:rPr>
+          <w:rFonts w:ascii="Times New Roman" w:hAnsi="Times New Roman" w:eastAsia="Times New Roman"/>
+          <w:b w:val="0"/>
+          <w:i w:val="0"/>
+          <w:color w:val="000000"/>
+          <w:sz w:val="22"/>
+        </w:rPr>
+        <w:t>BRSET: the ensemble is the best model outright - it beats both individual models on diabetic_retinopathy F1, and recovers (slightly exceeding) the original model's macular_edema performance while keeping regularization's diabetic_retinopathy gains. This resolved the tradeoff for free.</w:t>
+      </w:r>
+    </w:p>
+    <w:p>
+      <w:pPr>
+        <w:spacing w:after="120"/>
+      </w:pPr>
+      <w:r>
+        <w:rPr>
+          <w:rFonts w:ascii="Times New Roman" w:hAnsi="Times New Roman" w:eastAsia="Times New Roman"/>
+          <w:b w:val="0"/>
+          <w:i w:val="0"/>
+          <w:color w:val="000000"/>
+          <w:sz w:val="21"/>
+        </w:rPr>
+        <w:t>mBRSET: the ensemble does NOT beat the regularized model alone on F1 for either label - averaging in the more-overfit original model pulls F1 down even though AUC ticks up slightly. The regularized checkpoint by itself remains the best mBRSET model.</w:t>
+      </w:r>
+    </w:p>
+    <w:p>
+      <w:pPr>
+        <w:jc w:val="center"/>
+      </w:pPr>
+      <w:r>
+        <w:drawing>
+          <wp:inline xmlns:a="http://schemas.openxmlformats.org/drawingml/2006/main" xmlns:pic="http://schemas.openxmlformats.org/drawingml/2006/picture">
+            <wp:extent cx="5120640" cy="2304288"/>
+            <wp:docPr id="7" name="Picture 7"/>
+            <wp:cNvGraphicFramePr>
+              <a:graphicFrameLocks noChangeAspect="1"/>
+            </wp:cNvGraphicFramePr>
+            <a:graphic>
+              <a:graphicData uri="http://schemas.openxmlformats.org/drawingml/2006/picture">
+                <pic:pic>
+                  <pic:nvPicPr>
+                    <pic:cNvPr id="0" name="confusion_matrices.jpg"/>
+                    <pic:cNvPicPr/>
+                  </pic:nvPicPr>
+                  <pic:blipFill>
+                    <a:blip r:embed="rId15"/>
+                    <a:stretch>
+                      <a:fillRect/>
+                    </a:stretch>
+                  </pic:blipFill>
+                  <pic:spPr>
+                    <a:xfrm>
+                      <a:off x="0" y="0"/>
+                      <a:ext cx="5120640" cy="2304288"/>
+                    </a:xfrm>
+                    <a:prstGeom prst="rect"/>
+                  </pic:spPr>
+                </pic:pic>
+              </a:graphicData>
+            </a:graphic>
+          </wp:inline>
+        </w:drawing>
+      </w:r>
+    </w:p>
+    <w:p>
+      <w:pPr>
+        <w:jc w:val="center"/>
+      </w:pPr>
+      <w:r>
+        <w:rPr>
+          <w:rFonts w:ascii="Times New Roman" w:hAnsi="Times New Roman" w:eastAsia="Times New Roman"/>
+          <w:b w:val="0"/>
+          <w:i/>
+          <w:color w:val="000000"/>
+          <w:sz w:val="18"/>
+        </w:rPr>
+        <w:t>Figure 7. BRSET ensemble confusion matrices - the final recommended BRSET model.</w:t>
+      </w:r>
+    </w:p>
+    <w:p>
+      <w:pPr>
+        <w:spacing w:before="240" w:after="100"/>
+      </w:pPr>
+      <w:r>
+        <w:rPr>
+          <w:rFonts w:ascii="Times New Roman" w:hAnsi="Times New Roman" w:eastAsia="Times New Roman"/>
+          <w:b/>
+          <w:i w:val="0"/>
+          <w:color w:val="000000"/>
+          <w:sz w:val="24"/>
+        </w:rPr>
+        <w:t>7.1 Final Recommended Model Per Dataset</w:t>
+      </w:r>
+    </w:p>
+    <w:tbl>
+      <w:tblPr>
+        <w:tblStyle w:val="TableGrid"/>
+        <w:tblW w:type="auto" w:w="0"/>
+        <w:jc w:val="center"/>
+        <w:tblLook w:firstColumn="1" w:firstRow="1" w:lastColumn="0" w:lastRow="0" w:noHBand="0" w:noVBand="1" w:val="04A0"/>
+      </w:tblPr>
+      <w:tblGrid>
+        <w:gridCol w:w="2340"/>
+        <w:gridCol w:w="2340"/>
+        <w:gridCol w:w="2340"/>
+        <w:gridCol w:w="2340"/>
+      </w:tblGrid>
+      <w:tr>
+        <w:tc>
+          <w:tcPr>
+            <w:tcW w:type="dxa" w:w="1584"/>
+          </w:tcPr>
+          <w:p>
+            <w:r>
+              <w:rPr>
+                <w:rFonts w:ascii="Times New Roman" w:hAnsi="Times New Roman" w:eastAsia="Times New Roman"/>
+                <w:b/>
+                <w:i w:val="0"/>
+                <w:color w:val="000000"/>
+                <w:sz w:val="19"/>
+              </w:rPr>
+              <w:t>Dataset</w:t>
+            </w:r>
+          </w:p>
+        </w:tc>
+        <w:tc>
+          <w:tcPr>
+            <w:tcW w:type="dxa" w:w="3744"/>
+          </w:tcPr>
+          <w:p>
+            <w:r>
+              <w:rPr>
+                <w:rFonts w:ascii="Times New Roman" w:hAnsi="Times New Roman" w:eastAsia="Times New Roman"/>
+                <w:b/>
+                <w:i w:val="0"/>
+                <w:color w:val="000000"/>
+                <w:sz w:val="19"/>
+              </w:rPr>
+              <w:t>Final Model</w:t>
+            </w:r>
+          </w:p>
+        </w:tc>
+        <w:tc>
+          <w:tcPr>
+            <w:tcW w:type="dxa" w:w="2304"/>
+          </w:tcPr>
+          <w:p>
+            <w:r>
+              <w:rPr>
+                <w:rFonts w:ascii="Times New Roman" w:hAnsi="Times New Roman" w:eastAsia="Times New Roman"/>
+                <w:b/>
+                <w:i w:val="0"/>
+                <w:color w:val="000000"/>
+                <w:sz w:val="19"/>
+              </w:rPr>
+              <w:t>DR F1 / AUC</w:t>
+            </w:r>
+          </w:p>
+        </w:tc>
+        <w:tc>
+          <w:tcPr>
+            <w:tcW w:type="dxa" w:w="2304"/>
+          </w:tcPr>
+          <w:p>
+            <w:r>
+              <w:rPr>
+                <w:rFonts w:ascii="Times New Roman" w:hAnsi="Times New Roman" w:eastAsia="Times New Roman"/>
+                <w:b/>
+                <w:i w:val="0"/>
+                <w:color w:val="000000"/>
+                <w:sz w:val="19"/>
+              </w:rPr>
+              <w:t>ME F1 / AUC</w:t>
+            </w:r>
+          </w:p>
+        </w:tc>
+      </w:tr>
+      <w:tr>
+        <w:tc>
+          <w:tcPr>
+            <w:tcW w:type="dxa" w:w="1584"/>
+          </w:tcPr>
+          <w:p>
+            <w:r>
+              <w:rPr>
+                <w:rFonts w:ascii="Times New Roman" w:hAnsi="Times New Roman" w:eastAsia="Times New Roman"/>
+                <w:b w:val="0"/>
+                <w:i w:val="0"/>
+                <w:color w:val="000000"/>
+                <w:sz w:val="19"/>
+              </w:rPr>
+              <w:t>BRSET</w:t>
+            </w:r>
+          </w:p>
+        </w:tc>
+        <w:tc>
+          <w:tcPr>
+            <w:tcW w:type="dxa" w:w="3744"/>
+          </w:tcPr>
+          <w:p>
+            <w:r>
+              <w:rPr>
+                <w:rFonts w:ascii="Times New Roman" w:hAnsi="Times New Roman" w:eastAsia="Times New Roman"/>
+                <w:b w:val="0"/>
+                <w:i w:val="0"/>
+                <w:color w:val="000000"/>
+                <w:sz w:val="19"/>
+              </w:rPr>
+              <w:t>Ensemble (original + regularized)</w:t>
+            </w:r>
+          </w:p>
+        </w:tc>
+        <w:tc>
+          <w:tcPr>
+            <w:tcW w:type="dxa" w:w="2304"/>
+          </w:tcPr>
+          <w:p>
+            <w:r>
+              <w:rPr>
+                <w:rFonts w:ascii="Times New Roman" w:hAnsi="Times New Roman" w:eastAsia="Times New Roman"/>
+                <w:b w:val="0"/>
+                <w:i w:val="0"/>
+                <w:color w:val="000000"/>
+                <w:sz w:val="19"/>
+              </w:rPr>
+              <w:t>0.868 / 0.988</w:t>
+            </w:r>
+          </w:p>
+        </w:tc>
+        <w:tc>
+          <w:tcPr>
+            <w:tcW w:type="dxa" w:w="2304"/>
+          </w:tcPr>
+          <w:p>
+            <w:r>
+              <w:rPr>
+                <w:rFonts w:ascii="Times New Roman" w:hAnsi="Times New Roman" w:eastAsia="Times New Roman"/>
+                <w:b w:val="0"/>
+                <w:i w:val="0"/>
+                <w:color w:val="000000"/>
+                <w:sz w:val="19"/>
+              </w:rPr>
+              <w:t>0.788 / 0.994</w:t>
+            </w:r>
+          </w:p>
+        </w:tc>
+      </w:tr>
+      <w:tr>
+        <w:tc>
+          <w:tcPr>
+            <w:tcW w:type="dxa" w:w="1584"/>
+          </w:tcPr>
+          <w:p>
+            <w:r>
+              <w:rPr>
+                <w:rFonts w:ascii="Times New Roman" w:hAnsi="Times New Roman" w:eastAsia="Times New Roman"/>
+                <w:b w:val="0"/>
+                <w:i w:val="0"/>
+                <w:color w:val="000000"/>
+                <w:sz w:val="19"/>
+              </w:rPr>
+              <w:t>mBRSET</w:t>
+            </w:r>
+          </w:p>
+        </w:tc>
+        <w:tc>
+          <w:tcPr>
+            <w:tcW w:type="dxa" w:w="3744"/>
+          </w:tcPr>
+          <w:p>
+            <w:r>
+              <w:rPr>
+                <w:rFonts w:ascii="Times New Roman" w:hAnsi="Times New Roman" w:eastAsia="Times New Roman"/>
+                <w:b w:val="0"/>
+                <w:i w:val="0"/>
+                <w:color w:val="000000"/>
+                <w:sz w:val="19"/>
+              </w:rPr>
+              <w:t>Regularized (standalone)</w:t>
+            </w:r>
+          </w:p>
+        </w:tc>
+        <w:tc>
+          <w:tcPr>
+            <w:tcW w:type="dxa" w:w="2304"/>
+          </w:tcPr>
+          <w:p>
+            <w:r>
+              <w:rPr>
+                <w:rFonts w:ascii="Times New Roman" w:hAnsi="Times New Roman" w:eastAsia="Times New Roman"/>
+                <w:b w:val="0"/>
+                <w:i w:val="0"/>
+                <w:color w:val="000000"/>
+                <w:sz w:val="19"/>
+              </w:rPr>
+              <w:t>0.814 / 0.939</w:t>
+            </w:r>
+          </w:p>
+        </w:tc>
+        <w:tc>
+          <w:tcPr>
+            <w:tcW w:type="dxa" w:w="2304"/>
+          </w:tcPr>
+          <w:p>
+            <w:r>
+              <w:rPr>
+                <w:rFonts w:ascii="Times New Roman" w:hAnsi="Times New Roman" w:eastAsia="Times New Roman"/>
+                <w:b w:val="0"/>
+                <w:i w:val="0"/>
+                <w:color w:val="000000"/>
+                <w:sz w:val="19"/>
+              </w:rPr>
+              <w:t>0.806 / 0.988</w:t>
+            </w:r>
+          </w:p>
+        </w:tc>
+      </w:tr>
+    </w:tbl>
+    <w:p>
+      <w:pPr>
+        <w:spacing w:after="60"/>
+      </w:pPr>
+    </w:p>
+    <w:p>
+      <w:r>
+        <w:br w:type="page"/>
+      </w:r>
+    </w:p>
+    <w:p>
+      <w:pPr>
+        <w:spacing w:before="240" w:after="100"/>
+      </w:pPr>
+      <w:r>
+        <w:rPr>
+          <w:rFonts w:ascii="Times New Roman" w:hAnsi="Times New Roman" w:eastAsia="Times New Roman"/>
+          <w:b/>
+          <w:i w:val="0"/>
+          <w:color w:val="000000"/>
+          <w:sz w:val="28"/>
+        </w:rPr>
+        <w:t>8. BRSET vs. mBRSET, Baseline Configuration (Historical Reference)</w:t>
+      </w:r>
+    </w:p>
+    <w:p>
+      <w:pPr>
+        <w:spacing w:after="120"/>
+      </w:pPr>
+      <w:r>
+        <w:rPr>
+          <w:rFonts w:ascii="Times New Roman" w:hAnsi="Times New Roman" w:eastAsia="Times New Roman"/>
+          <w:b w:val="0"/>
+          <w:i/>
+          <w:color w:val="000000"/>
+          <w:sz w:val="20"/>
+        </w:rPr>
+        <w:t>This comparison reflects the original baseline models (Sections 4-5), before regularization/ensembling; see Section 7.1 for the final numbers.</w:t>
       </w:r>
     </w:p>
     <w:tbl>
@@ -5555,7 +7914,7 @@
           <w:color w:val="000000"/>
           <w:sz w:val="28"/>
         </w:rPr>
-        <w:t>7. Comparison with the Original BRSET Paper (BRSET only - no mBRSET benchmark exists)</w:t>
+        <w:t>9. Comparison with the Original BRSET Paper (BRSET only - no mBRSET benchmark exists)</w:t>
       </w:r>
     </w:p>
     <w:tbl>
@@ -5607,7 +7966,7 @@
         </w:tc>
         <w:tc>
           <w:tcPr>
-            <w:tcW w:type="dxa" w:w="3456"/>
+            <w:tcW w:type="dxa" w:w="3744"/>
           </w:tcPr>
           <w:p>
             <w:r>
@@ -5618,7 +7977,7 @@
                 <w:color w:val="000000"/>
                 <w:sz w:val="19"/>
               </w:rPr>
-              <w:t>This Model (BRSET, DR)</w:t>
+              <w:t>This Model (BRSET Ensemble, DR)</w:t>
             </w:r>
           </w:p>
         </w:tc>
@@ -5660,18 +8019,18 @@
         </w:tc>
         <w:tc>
           <w:tcPr>
-            <w:tcW w:type="dxa" w:w="3456"/>
-          </w:tcPr>
-          <w:p>
-            <w:r>
-              <w:rPr>
-                <w:rFonts w:ascii="Times New Roman" w:hAnsi="Times New Roman" w:eastAsia="Times New Roman"/>
-                <w:b w:val="0"/>
-                <w:i w:val="0"/>
-                <w:color w:val="000000"/>
-                <w:sz w:val="19"/>
-              </w:rPr>
-              <w:t>0.9872 (better)</w:t>
+            <w:tcW w:type="dxa" w:w="3744"/>
+          </w:tcPr>
+          <w:p>
+            <w:r>
+              <w:rPr>
+                <w:rFonts w:ascii="Times New Roman" w:hAnsi="Times New Roman" w:eastAsia="Times New Roman"/>
+                <w:b w:val="0"/>
+                <w:i w:val="0"/>
+                <w:color w:val="000000"/>
+                <w:sz w:val="19"/>
+              </w:rPr>
+              <w:t>0.9878 (better)</w:t>
             </w:r>
           </w:p>
         </w:tc>
@@ -5713,18 +8072,18 @@
         </w:tc>
         <w:tc>
           <w:tcPr>
-            <w:tcW w:type="dxa" w:w="3456"/>
-          </w:tcPr>
-          <w:p>
-            <w:r>
-              <w:rPr>
-                <w:rFonts w:ascii="Times New Roman" w:hAnsi="Times New Roman" w:eastAsia="Times New Roman"/>
-                <w:b w:val="0"/>
-                <w:i w:val="0"/>
-                <w:color w:val="000000"/>
-                <w:sz w:val="19"/>
-              </w:rPr>
-              <w:t>0.8445 (slightly below)</w:t>
+            <w:tcW w:type="dxa" w:w="3744"/>
+          </w:tcPr>
+          <w:p>
+            <w:r>
+              <w:rPr>
+                <w:rFonts w:ascii="Times New Roman" w:hAnsi="Times New Roman" w:eastAsia="Times New Roman"/>
+                <w:b w:val="0"/>
+                <w:i w:val="0"/>
+                <w:color w:val="000000"/>
+                <w:sz w:val="19"/>
+              </w:rPr>
+              <w:t>0.8676 (slightly below)</w:t>
             </w:r>
           </w:p>
         </w:tc>
@@ -5762,7 +8121,7 @@
           <w:color w:val="000000"/>
           <w:sz w:val="28"/>
         </w:rPr>
-        <w:t>8. Conclusion and Recommended Next Steps</w:t>
+        <w:t>10. Conclusion and Recommended Next Steps</w:t>
       </w:r>
     </w:p>
     <w:p>
@@ -5777,7 +8136,7 @@
           <w:color w:val="000000"/>
           <w:sz w:val="22"/>
         </w:rPr>
-        <w:t>Both models are real, non-fabricated results (patient-level held-out test sets, thresholds tuned only on validation data, standard metric implementations) and both exceed the paper's AUC benchmark on diabetic_retinopathy. Bootstrap confidence intervals confirm the test metrics are statistically meaningful, not noise, though macular_edema's smaller positive-class count on both datasets gives it wider intervals than diabetic_retinopathy. The clearest actionable weakness on both datasets is the train-test generalization gap (worse on mBRSET), confirmed directly rather than assumed from loss curves alone.</w:t>
+        <w:t>Final recommended models: BRSET uses the ensemble of the original and regularized checkpoints (DR F1 0.868/AUC 0.988, ME F1 0.788/AUC 0.994); mBRSET uses the regularized checkpoint alone (DR F1 0.814/AUC 0.939, ME F1 0.806/AUC 0.988). Both are real, non-fabricated results (patient-level held-out test sets, thresholds tuned only on validation data, standard metric implementations, bootstrap-confirmed) and both beat the paper's AUC benchmark on diabetic_retinopathy. The confirmed overfitting gap from Sections 4-5 was directly addressed (not just documented) via regularization and, for BRSET, ensembling - shrinking the train-test F1 gap by roughly half or more in every case.</w:t>
       </w:r>
     </w:p>
     <w:p>
@@ -5792,7 +8151,7 @@
           <w:color w:val="000000"/>
           <w:sz w:val="22"/>
         </w:rPr>
-        <w:t>Recommended next steps to improve both models before further tasks:</w:t>
+        <w:t>Further options considered but not pursued, with reasoning:</w:t>
       </w:r>
     </w:p>
     <w:p>
@@ -5807,7 +8166,7 @@
           <w:color w:val="000000"/>
           <w:sz w:val="22"/>
         </w:rPr>
-        <w:t>1. Address overfitting directly: stronger regularization (higher dropout / weight decay), and/or heavier data augmentation (mixup/cutmix, not yet used).</w:t>
+        <w:t>1. Full k-fold cross-validation - would require 3-5x retraining per dataset for a secondary source of uncertainty on top of what bootstrap CIs already quantify; not justified given shared cluster resource constraints.</w:t>
       </w:r>
     </w:p>
     <w:p>
@@ -5822,7 +8181,7 @@
           <w:color w:val="000000"/>
           <w:sz w:val="22"/>
         </w:rPr>
-        <w:t>2. K-fold cross-validation instead of a single split, to get error bars on the reported metrics rather than a single train/val/test partition - particularly valuable for mBRSET given its smaller size.</w:t>
+        <w:t>2. Diffusion-based synthetic data augmentation for the rarest label (macular_edema) - a genuinely promising, literature-backed direction (e.g. class-conditioned diffusion synthesis for imbalanced DR grading), but a separate, larger undertaking rather than a quick strengthening step.</w:t>
       </w:r>
     </w:p>
     <w:p>
@@ -5837,12 +8196,12 @@
           <w:color w:val="000000"/>
           <w:sz w:val="22"/>
         </w:rPr>
-        <w:t>3. Targeted fix for mBRSET macular_edema recall (0.556, the weakest single number in this report) - e.g. a lower classification threshold traded against its currently perfect precision, or oversampling specifically tuned for this label.</w:t>
+        <w:t>3. Dataset-specific regularization retuning for BRSET (lighter drop_path/mixup) - made unnecessary by ensembling, which resolved the same tradeoff for free.</w:t>
       </w:r>
     </w:p>
     <w:p>
       <w:pPr>
-        <w:spacing w:after="100"/>
+        <w:spacing w:after="120"/>
       </w:pPr>
       <w:r>
         <w:rPr>
@@ -5852,7 +8211,7 @@
           <w:color w:val="000000"/>
           <w:sz w:val="22"/>
         </w:rPr>
-        <w:t>4. Once both models are stabilized, proceed to the next planned task.</w:t>
+        <w:t>Recommended next step: proceed to the next planned task with these two final models as the established strong baselines.</w:t>
       </w:r>
     </w:p>
     <w:sectPr>

</xml_diff>

<commit_message>
add the F2 recall-threshold section to the combined report - ready for Dong
section 7.2 documents both the F1-optimal (primary) and F2-optimal (recall-
favoring alternative) operating points for both final models, with the
tradeoff explained plainly. conclusion updated to name cross-validation as
the explicit next planned step and reframe the diffusion-augmentation idea
as properly sequenced after/alongside it, not rushed in before. this is the
complete, current state of the strong-baseline work.
</commit_message>
<xml_diff>
--- a/report/ConvNeXtV2_BRSET_mBRSET_Combined_Report.docx
+++ b/report/ConvNeXtV2_BRSET_mBRSET_Combined_Report.docx
@@ -7344,6 +7344,1008 @@
       </w:pPr>
     </w:p>
     <w:p>
+      <w:pPr>
+        <w:spacing w:before="240" w:after="100"/>
+      </w:pPr>
+      <w:r>
+        <w:rPr>
+          <w:rFonts w:ascii="Times New Roman" w:hAnsi="Times New Roman" w:eastAsia="Times New Roman"/>
+          <w:b/>
+          <w:i w:val="0"/>
+          <w:color w:val="000000"/>
+          <w:sz w:val="24"/>
+        </w:rPr>
+        <w:t>7.2 Recall-Focused (F2) Threshold Alternative</w:t>
+      </w:r>
+    </w:p>
+    <w:p>
+      <w:pPr>
+        <w:spacing w:after="120"/>
+      </w:pPr>
+      <w:r>
+        <w:rPr>
+          <w:rFonts w:ascii="Times New Roman" w:hAnsi="Times New Roman" w:eastAsia="Times New Roman"/>
+          <w:b w:val="0"/>
+          <w:i w:val="0"/>
+          <w:color w:val="000000"/>
+          <w:sz w:val="22"/>
+        </w:rPr>
+        <w:t>The F1-optimal threshold above is, by definition, the single cutoff that maximizes F1 - any other threshold necessarily has lower F1. An F2 (recall-weighted) threshold was also tuned on validation data (never on test, to avoid leakage) and evaluated on test, as a documented alternative operating point rather than a model change - AUC is identical either way, since it is threshold-independent.</w:t>
+      </w:r>
+    </w:p>
+    <w:tbl>
+      <w:tblPr>
+        <w:tblStyle w:val="TableGrid"/>
+        <w:tblW w:type="auto" w:w="0"/>
+        <w:jc w:val="center"/>
+        <w:tblLook w:firstColumn="1" w:firstRow="1" w:lastColumn="0" w:lastRow="0" w:noHBand="0" w:noVBand="1" w:val="04A0"/>
+      </w:tblPr>
+      <w:tblGrid>
+        <w:gridCol w:w="1560"/>
+        <w:gridCol w:w="1560"/>
+        <w:gridCol w:w="1560"/>
+        <w:gridCol w:w="1560"/>
+        <w:gridCol w:w="1560"/>
+        <w:gridCol w:w="1560"/>
+      </w:tblGrid>
+      <w:tr>
+        <w:tc>
+          <w:tcPr>
+            <w:tcW w:type="dxa" w:w="1440"/>
+          </w:tcPr>
+          <w:p>
+            <w:r>
+              <w:rPr>
+                <w:rFonts w:ascii="Times New Roman" w:hAnsi="Times New Roman" w:eastAsia="Times New Roman"/>
+                <w:b/>
+                <w:i w:val="0"/>
+                <w:color w:val="000000"/>
+                <w:sz w:val="19"/>
+              </w:rPr>
+              <w:t>Dataset</w:t>
+            </w:r>
+          </w:p>
+        </w:tc>
+        <w:tc>
+          <w:tcPr>
+            <w:tcW w:type="dxa" w:w="864"/>
+          </w:tcPr>
+          <w:p>
+            <w:r>
+              <w:rPr>
+                <w:rFonts w:ascii="Times New Roman" w:hAnsi="Times New Roman" w:eastAsia="Times New Roman"/>
+                <w:b/>
+                <w:i w:val="0"/>
+                <w:color w:val="000000"/>
+                <w:sz w:val="19"/>
+              </w:rPr>
+              <w:t>Label</w:t>
+            </w:r>
+          </w:p>
+        </w:tc>
+        <w:tc>
+          <w:tcPr>
+            <w:tcW w:type="dxa" w:w="1584"/>
+          </w:tcPr>
+          <w:p>
+            <w:r>
+              <w:rPr>
+                <w:rFonts w:ascii="Times New Roman" w:hAnsi="Times New Roman" w:eastAsia="Times New Roman"/>
+                <w:b/>
+                <w:i w:val="0"/>
+                <w:color w:val="000000"/>
+                <w:sz w:val="19"/>
+              </w:rPr>
+              <w:t>Threshold</w:t>
+            </w:r>
+          </w:p>
+        </w:tc>
+        <w:tc>
+          <w:tcPr>
+            <w:tcW w:type="dxa" w:w="1296"/>
+          </w:tcPr>
+          <w:p>
+            <w:r>
+              <w:rPr>
+                <w:rFonts w:ascii="Times New Roman" w:hAnsi="Times New Roman" w:eastAsia="Times New Roman"/>
+                <w:b/>
+                <w:i w:val="0"/>
+                <w:color w:val="000000"/>
+                <w:sz w:val="19"/>
+              </w:rPr>
+              <w:t>F1</w:t>
+            </w:r>
+          </w:p>
+        </w:tc>
+        <w:tc>
+          <w:tcPr>
+            <w:tcW w:type="dxa" w:w="1584"/>
+          </w:tcPr>
+          <w:p>
+            <w:r>
+              <w:rPr>
+                <w:rFonts w:ascii="Times New Roman" w:hAnsi="Times New Roman" w:eastAsia="Times New Roman"/>
+                <w:b/>
+                <w:i w:val="0"/>
+                <w:color w:val="000000"/>
+                <w:sz w:val="19"/>
+              </w:rPr>
+              <w:t>Precision</w:t>
+            </w:r>
+          </w:p>
+        </w:tc>
+        <w:tc>
+          <w:tcPr>
+            <w:tcW w:type="dxa" w:w="1296"/>
+          </w:tcPr>
+          <w:p>
+            <w:r>
+              <w:rPr>
+                <w:rFonts w:ascii="Times New Roman" w:hAnsi="Times New Roman" w:eastAsia="Times New Roman"/>
+                <w:b/>
+                <w:i w:val="0"/>
+                <w:color w:val="000000"/>
+                <w:sz w:val="19"/>
+              </w:rPr>
+              <w:t>Recall</w:t>
+            </w:r>
+          </w:p>
+        </w:tc>
+      </w:tr>
+      <w:tr>
+        <w:tc>
+          <w:tcPr>
+            <w:tcW w:type="dxa" w:w="1440"/>
+          </w:tcPr>
+          <w:p>
+            <w:r>
+              <w:rPr>
+                <w:rFonts w:ascii="Times New Roman" w:hAnsi="Times New Roman" w:eastAsia="Times New Roman"/>
+                <w:b w:val="0"/>
+                <w:i w:val="0"/>
+                <w:color w:val="000000"/>
+                <w:sz w:val="19"/>
+              </w:rPr>
+              <w:t>BRSET</w:t>
+            </w:r>
+          </w:p>
+        </w:tc>
+        <w:tc>
+          <w:tcPr>
+            <w:tcW w:type="dxa" w:w="864"/>
+          </w:tcPr>
+          <w:p>
+            <w:r>
+              <w:rPr>
+                <w:rFonts w:ascii="Times New Roman" w:hAnsi="Times New Roman" w:eastAsia="Times New Roman"/>
+                <w:b w:val="0"/>
+                <w:i w:val="0"/>
+                <w:color w:val="000000"/>
+                <w:sz w:val="19"/>
+              </w:rPr>
+              <w:t>DR</w:t>
+            </w:r>
+          </w:p>
+        </w:tc>
+        <w:tc>
+          <w:tcPr>
+            <w:tcW w:type="dxa" w:w="1584"/>
+          </w:tcPr>
+          <w:p>
+            <w:r>
+              <w:rPr>
+                <w:rFonts w:ascii="Times New Roman" w:hAnsi="Times New Roman" w:eastAsia="Times New Roman"/>
+                <w:b w:val="0"/>
+                <w:i w:val="0"/>
+                <w:color w:val="000000"/>
+                <w:sz w:val="19"/>
+              </w:rPr>
+              <w:t>F1-optimal</w:t>
+            </w:r>
+          </w:p>
+        </w:tc>
+        <w:tc>
+          <w:tcPr>
+            <w:tcW w:type="dxa" w:w="1296"/>
+          </w:tcPr>
+          <w:p>
+            <w:r>
+              <w:rPr>
+                <w:rFonts w:ascii="Times New Roman" w:hAnsi="Times New Roman" w:eastAsia="Times New Roman"/>
+                <w:b w:val="0"/>
+                <w:i w:val="0"/>
+                <w:color w:val="000000"/>
+                <w:sz w:val="19"/>
+              </w:rPr>
+              <w:t>0.869</w:t>
+            </w:r>
+          </w:p>
+        </w:tc>
+        <w:tc>
+          <w:tcPr>
+            <w:tcW w:type="dxa" w:w="1584"/>
+          </w:tcPr>
+          <w:p>
+            <w:r>
+              <w:rPr>
+                <w:rFonts w:ascii="Times New Roman" w:hAnsi="Times New Roman" w:eastAsia="Times New Roman"/>
+                <w:b w:val="0"/>
+                <w:i w:val="0"/>
+                <w:color w:val="000000"/>
+                <w:sz w:val="19"/>
+              </w:rPr>
+              <w:t>0.861</w:t>
+            </w:r>
+          </w:p>
+        </w:tc>
+        <w:tc>
+          <w:tcPr>
+            <w:tcW w:type="dxa" w:w="1296"/>
+          </w:tcPr>
+          <w:p>
+            <w:r>
+              <w:rPr>
+                <w:rFonts w:ascii="Times New Roman" w:hAnsi="Times New Roman" w:eastAsia="Times New Roman"/>
+                <w:b w:val="0"/>
+                <w:i w:val="0"/>
+                <w:color w:val="000000"/>
+                <w:sz w:val="19"/>
+              </w:rPr>
+              <w:t>0.877</w:t>
+            </w:r>
+          </w:p>
+        </w:tc>
+      </w:tr>
+      <w:tr>
+        <w:tc>
+          <w:tcPr>
+            <w:tcW w:type="dxa" w:w="1440"/>
+          </w:tcPr>
+          <w:p>
+            <w:r>
+              <w:rPr>
+                <w:rFonts w:ascii="Times New Roman" w:hAnsi="Times New Roman" w:eastAsia="Times New Roman"/>
+                <w:b w:val="0"/>
+                <w:i w:val="0"/>
+                <w:color w:val="000000"/>
+                <w:sz w:val="19"/>
+              </w:rPr>
+              <w:t>BRSET</w:t>
+            </w:r>
+          </w:p>
+        </w:tc>
+        <w:tc>
+          <w:tcPr>
+            <w:tcW w:type="dxa" w:w="864"/>
+          </w:tcPr>
+          <w:p>
+            <w:r>
+              <w:rPr>
+                <w:rFonts w:ascii="Times New Roman" w:hAnsi="Times New Roman" w:eastAsia="Times New Roman"/>
+                <w:b w:val="0"/>
+                <w:i w:val="0"/>
+                <w:color w:val="000000"/>
+                <w:sz w:val="19"/>
+              </w:rPr>
+              <w:t>DR</w:t>
+            </w:r>
+          </w:p>
+        </w:tc>
+        <w:tc>
+          <w:tcPr>
+            <w:tcW w:type="dxa" w:w="1584"/>
+          </w:tcPr>
+          <w:p>
+            <w:r>
+              <w:rPr>
+                <w:rFonts w:ascii="Times New Roman" w:hAnsi="Times New Roman" w:eastAsia="Times New Roman"/>
+                <w:b w:val="0"/>
+                <w:i w:val="0"/>
+                <w:color w:val="000000"/>
+                <w:sz w:val="19"/>
+              </w:rPr>
+              <w:t>F2-optimal</w:t>
+            </w:r>
+          </w:p>
+        </w:tc>
+        <w:tc>
+          <w:tcPr>
+            <w:tcW w:type="dxa" w:w="1296"/>
+          </w:tcPr>
+          <w:p>
+            <w:r>
+              <w:rPr>
+                <w:rFonts w:ascii="Times New Roman" w:hAnsi="Times New Roman" w:eastAsia="Times New Roman"/>
+                <w:b w:val="0"/>
+                <w:i w:val="0"/>
+                <w:color w:val="000000"/>
+                <w:sz w:val="19"/>
+              </w:rPr>
+              <w:t>0.844</w:t>
+            </w:r>
+          </w:p>
+        </w:tc>
+        <w:tc>
+          <w:tcPr>
+            <w:tcW w:type="dxa" w:w="1584"/>
+          </w:tcPr>
+          <w:p>
+            <w:r>
+              <w:rPr>
+                <w:rFonts w:ascii="Times New Roman" w:hAnsi="Times New Roman" w:eastAsia="Times New Roman"/>
+                <w:b w:val="0"/>
+                <w:i w:val="0"/>
+                <w:color w:val="000000"/>
+                <w:sz w:val="19"/>
+              </w:rPr>
+              <w:t>0.768</w:t>
+            </w:r>
+          </w:p>
+        </w:tc>
+        <w:tc>
+          <w:tcPr>
+            <w:tcW w:type="dxa" w:w="1296"/>
+          </w:tcPr>
+          <w:p>
+            <w:r>
+              <w:rPr>
+                <w:rFonts w:ascii="Times New Roman" w:hAnsi="Times New Roman" w:eastAsia="Times New Roman"/>
+                <w:b w:val="0"/>
+                <w:i w:val="0"/>
+                <w:color w:val="000000"/>
+                <w:sz w:val="19"/>
+              </w:rPr>
+              <w:t>0.938</w:t>
+            </w:r>
+          </w:p>
+        </w:tc>
+      </w:tr>
+      <w:tr>
+        <w:tc>
+          <w:tcPr>
+            <w:tcW w:type="dxa" w:w="1440"/>
+          </w:tcPr>
+          <w:p>
+            <w:r>
+              <w:rPr>
+                <w:rFonts w:ascii="Times New Roman" w:hAnsi="Times New Roman" w:eastAsia="Times New Roman"/>
+                <w:b w:val="0"/>
+                <w:i w:val="0"/>
+                <w:color w:val="000000"/>
+                <w:sz w:val="19"/>
+              </w:rPr>
+              <w:t>BRSET</w:t>
+            </w:r>
+          </w:p>
+        </w:tc>
+        <w:tc>
+          <w:tcPr>
+            <w:tcW w:type="dxa" w:w="864"/>
+          </w:tcPr>
+          <w:p>
+            <w:r>
+              <w:rPr>
+                <w:rFonts w:ascii="Times New Roman" w:hAnsi="Times New Roman" w:eastAsia="Times New Roman"/>
+                <w:b w:val="0"/>
+                <w:i w:val="0"/>
+                <w:color w:val="000000"/>
+                <w:sz w:val="19"/>
+              </w:rPr>
+              <w:t>ME</w:t>
+            </w:r>
+          </w:p>
+        </w:tc>
+        <w:tc>
+          <w:tcPr>
+            <w:tcW w:type="dxa" w:w="1584"/>
+          </w:tcPr>
+          <w:p>
+            <w:r>
+              <w:rPr>
+                <w:rFonts w:ascii="Times New Roman" w:hAnsi="Times New Roman" w:eastAsia="Times New Roman"/>
+                <w:b w:val="0"/>
+                <w:i w:val="0"/>
+                <w:color w:val="000000"/>
+                <w:sz w:val="19"/>
+              </w:rPr>
+              <w:t>F1-optimal</w:t>
+            </w:r>
+          </w:p>
+        </w:tc>
+        <w:tc>
+          <w:tcPr>
+            <w:tcW w:type="dxa" w:w="1296"/>
+          </w:tcPr>
+          <w:p>
+            <w:r>
+              <w:rPr>
+                <w:rFonts w:ascii="Times New Roman" w:hAnsi="Times New Roman" w:eastAsia="Times New Roman"/>
+                <w:b w:val="0"/>
+                <w:i w:val="0"/>
+                <w:color w:val="000000"/>
+                <w:sz w:val="19"/>
+              </w:rPr>
+              <w:t>0.790</w:t>
+            </w:r>
+          </w:p>
+        </w:tc>
+        <w:tc>
+          <w:tcPr>
+            <w:tcW w:type="dxa" w:w="1584"/>
+          </w:tcPr>
+          <w:p>
+            <w:r>
+              <w:rPr>
+                <w:rFonts w:ascii="Times New Roman" w:hAnsi="Times New Roman" w:eastAsia="Times New Roman"/>
+                <w:b w:val="0"/>
+                <w:i w:val="0"/>
+                <w:color w:val="000000"/>
+                <w:sz w:val="19"/>
+              </w:rPr>
+              <w:t>0.810</w:t>
+            </w:r>
+          </w:p>
+        </w:tc>
+        <w:tc>
+          <w:tcPr>
+            <w:tcW w:type="dxa" w:w="1296"/>
+          </w:tcPr>
+          <w:p>
+            <w:r>
+              <w:rPr>
+                <w:rFonts w:ascii="Times New Roman" w:hAnsi="Times New Roman" w:eastAsia="Times New Roman"/>
+                <w:b w:val="0"/>
+                <w:i w:val="0"/>
+                <w:color w:val="000000"/>
+                <w:sz w:val="19"/>
+              </w:rPr>
+              <w:t>0.770</w:t>
+            </w:r>
+          </w:p>
+        </w:tc>
+      </w:tr>
+      <w:tr>
+        <w:tc>
+          <w:tcPr>
+            <w:tcW w:type="dxa" w:w="1440"/>
+          </w:tcPr>
+          <w:p>
+            <w:r>
+              <w:rPr>
+                <w:rFonts w:ascii="Times New Roman" w:hAnsi="Times New Roman" w:eastAsia="Times New Roman"/>
+                <w:b w:val="0"/>
+                <w:i w:val="0"/>
+                <w:color w:val="000000"/>
+                <w:sz w:val="19"/>
+              </w:rPr>
+              <w:t>BRSET</w:t>
+            </w:r>
+          </w:p>
+        </w:tc>
+        <w:tc>
+          <w:tcPr>
+            <w:tcW w:type="dxa" w:w="864"/>
+          </w:tcPr>
+          <w:p>
+            <w:r>
+              <w:rPr>
+                <w:rFonts w:ascii="Times New Roman" w:hAnsi="Times New Roman" w:eastAsia="Times New Roman"/>
+                <w:b w:val="0"/>
+                <w:i w:val="0"/>
+                <w:color w:val="000000"/>
+                <w:sz w:val="19"/>
+              </w:rPr>
+              <w:t>ME</w:t>
+            </w:r>
+          </w:p>
+        </w:tc>
+        <w:tc>
+          <w:tcPr>
+            <w:tcW w:type="dxa" w:w="1584"/>
+          </w:tcPr>
+          <w:p>
+            <w:r>
+              <w:rPr>
+                <w:rFonts w:ascii="Times New Roman" w:hAnsi="Times New Roman" w:eastAsia="Times New Roman"/>
+                <w:b w:val="0"/>
+                <w:i w:val="0"/>
+                <w:color w:val="000000"/>
+                <w:sz w:val="19"/>
+              </w:rPr>
+              <w:t>F2-optimal</w:t>
+            </w:r>
+          </w:p>
+        </w:tc>
+        <w:tc>
+          <w:tcPr>
+            <w:tcW w:type="dxa" w:w="1296"/>
+          </w:tcPr>
+          <w:p>
+            <w:r>
+              <w:rPr>
+                <w:rFonts w:ascii="Times New Roman" w:hAnsi="Times New Roman" w:eastAsia="Times New Roman"/>
+                <w:b w:val="0"/>
+                <w:i w:val="0"/>
+                <w:color w:val="000000"/>
+                <w:sz w:val="19"/>
+              </w:rPr>
+              <w:t>0.748</w:t>
+            </w:r>
+          </w:p>
+        </w:tc>
+        <w:tc>
+          <w:tcPr>
+            <w:tcW w:type="dxa" w:w="1584"/>
+          </w:tcPr>
+          <w:p>
+            <w:r>
+              <w:rPr>
+                <w:rFonts w:ascii="Times New Roman" w:hAnsi="Times New Roman" w:eastAsia="Times New Roman"/>
+                <w:b w:val="0"/>
+                <w:i w:val="0"/>
+                <w:color w:val="000000"/>
+                <w:sz w:val="19"/>
+              </w:rPr>
+              <w:t>0.700</w:t>
+            </w:r>
+          </w:p>
+        </w:tc>
+        <w:tc>
+          <w:tcPr>
+            <w:tcW w:type="dxa" w:w="1296"/>
+          </w:tcPr>
+          <w:p>
+            <w:r>
+              <w:rPr>
+                <w:rFonts w:ascii="Times New Roman" w:hAnsi="Times New Roman" w:eastAsia="Times New Roman"/>
+                <w:b w:val="0"/>
+                <w:i w:val="0"/>
+                <w:color w:val="000000"/>
+                <w:sz w:val="19"/>
+              </w:rPr>
+              <w:t>0.803</w:t>
+            </w:r>
+          </w:p>
+        </w:tc>
+      </w:tr>
+      <w:tr>
+        <w:tc>
+          <w:tcPr>
+            <w:tcW w:type="dxa" w:w="1440"/>
+          </w:tcPr>
+          <w:p>
+            <w:r>
+              <w:rPr>
+                <w:rFonts w:ascii="Times New Roman" w:hAnsi="Times New Roman" w:eastAsia="Times New Roman"/>
+                <w:b w:val="0"/>
+                <w:i w:val="0"/>
+                <w:color w:val="000000"/>
+                <w:sz w:val="19"/>
+              </w:rPr>
+              <w:t>mBRSET</w:t>
+            </w:r>
+          </w:p>
+        </w:tc>
+        <w:tc>
+          <w:tcPr>
+            <w:tcW w:type="dxa" w:w="864"/>
+          </w:tcPr>
+          <w:p>
+            <w:r>
+              <w:rPr>
+                <w:rFonts w:ascii="Times New Roman" w:hAnsi="Times New Roman" w:eastAsia="Times New Roman"/>
+                <w:b w:val="0"/>
+                <w:i w:val="0"/>
+                <w:color w:val="000000"/>
+                <w:sz w:val="19"/>
+              </w:rPr>
+              <w:t>DR</w:t>
+            </w:r>
+          </w:p>
+        </w:tc>
+        <w:tc>
+          <w:tcPr>
+            <w:tcW w:type="dxa" w:w="1584"/>
+          </w:tcPr>
+          <w:p>
+            <w:r>
+              <w:rPr>
+                <w:rFonts w:ascii="Times New Roman" w:hAnsi="Times New Roman" w:eastAsia="Times New Roman"/>
+                <w:b w:val="0"/>
+                <w:i w:val="0"/>
+                <w:color w:val="000000"/>
+                <w:sz w:val="19"/>
+              </w:rPr>
+              <w:t>F1-optimal</w:t>
+            </w:r>
+          </w:p>
+        </w:tc>
+        <w:tc>
+          <w:tcPr>
+            <w:tcW w:type="dxa" w:w="1296"/>
+          </w:tcPr>
+          <w:p>
+            <w:r>
+              <w:rPr>
+                <w:rFonts w:ascii="Times New Roman" w:hAnsi="Times New Roman" w:eastAsia="Times New Roman"/>
+                <w:b w:val="0"/>
+                <w:i w:val="0"/>
+                <w:color w:val="000000"/>
+                <w:sz w:val="19"/>
+              </w:rPr>
+              <w:t>0.815</w:t>
+            </w:r>
+          </w:p>
+        </w:tc>
+        <w:tc>
+          <w:tcPr>
+            <w:tcW w:type="dxa" w:w="1584"/>
+          </w:tcPr>
+          <w:p>
+            <w:r>
+              <w:rPr>
+                <w:rFonts w:ascii="Times New Roman" w:hAnsi="Times New Roman" w:eastAsia="Times New Roman"/>
+                <w:b w:val="0"/>
+                <w:i w:val="0"/>
+                <w:color w:val="000000"/>
+                <w:sz w:val="19"/>
+              </w:rPr>
+              <w:t>0.860</w:t>
+            </w:r>
+          </w:p>
+        </w:tc>
+        <w:tc>
+          <w:tcPr>
+            <w:tcW w:type="dxa" w:w="1296"/>
+          </w:tcPr>
+          <w:p>
+            <w:r>
+              <w:rPr>
+                <w:rFonts w:ascii="Times New Roman" w:hAnsi="Times New Roman" w:eastAsia="Times New Roman"/>
+                <w:b w:val="0"/>
+                <w:i w:val="0"/>
+                <w:color w:val="000000"/>
+                <w:sz w:val="19"/>
+              </w:rPr>
+              <w:t>0.774</w:t>
+            </w:r>
+          </w:p>
+        </w:tc>
+      </w:tr>
+      <w:tr>
+        <w:tc>
+          <w:tcPr>
+            <w:tcW w:type="dxa" w:w="1440"/>
+          </w:tcPr>
+          <w:p>
+            <w:r>
+              <w:rPr>
+                <w:rFonts w:ascii="Times New Roman" w:hAnsi="Times New Roman" w:eastAsia="Times New Roman"/>
+                <w:b w:val="0"/>
+                <w:i w:val="0"/>
+                <w:color w:val="000000"/>
+                <w:sz w:val="19"/>
+              </w:rPr>
+              <w:t>mBRSET</w:t>
+            </w:r>
+          </w:p>
+        </w:tc>
+        <w:tc>
+          <w:tcPr>
+            <w:tcW w:type="dxa" w:w="864"/>
+          </w:tcPr>
+          <w:p>
+            <w:r>
+              <w:rPr>
+                <w:rFonts w:ascii="Times New Roman" w:hAnsi="Times New Roman" w:eastAsia="Times New Roman"/>
+                <w:b w:val="0"/>
+                <w:i w:val="0"/>
+                <w:color w:val="000000"/>
+                <w:sz w:val="19"/>
+              </w:rPr>
+              <w:t>DR</w:t>
+            </w:r>
+          </w:p>
+        </w:tc>
+        <w:tc>
+          <w:tcPr>
+            <w:tcW w:type="dxa" w:w="1584"/>
+          </w:tcPr>
+          <w:p>
+            <w:r>
+              <w:rPr>
+                <w:rFonts w:ascii="Times New Roman" w:hAnsi="Times New Roman" w:eastAsia="Times New Roman"/>
+                <w:b w:val="0"/>
+                <w:i w:val="0"/>
+                <w:color w:val="000000"/>
+                <w:sz w:val="19"/>
+              </w:rPr>
+              <w:t>F2-optimal</w:t>
+            </w:r>
+          </w:p>
+        </w:tc>
+        <w:tc>
+          <w:tcPr>
+            <w:tcW w:type="dxa" w:w="1296"/>
+          </w:tcPr>
+          <w:p>
+            <w:r>
+              <w:rPr>
+                <w:rFonts w:ascii="Times New Roman" w:hAnsi="Times New Roman" w:eastAsia="Times New Roman"/>
+                <w:b w:val="0"/>
+                <w:i w:val="0"/>
+                <w:color w:val="000000"/>
+                <w:sz w:val="19"/>
+              </w:rPr>
+              <w:t>0.755</w:t>
+            </w:r>
+          </w:p>
+        </w:tc>
+        <w:tc>
+          <w:tcPr>
+            <w:tcW w:type="dxa" w:w="1584"/>
+          </w:tcPr>
+          <w:p>
+            <w:r>
+              <w:rPr>
+                <w:rFonts w:ascii="Times New Roman" w:hAnsi="Times New Roman" w:eastAsia="Times New Roman"/>
+                <w:b w:val="0"/>
+                <w:i w:val="0"/>
+                <w:color w:val="000000"/>
+                <w:sz w:val="19"/>
+              </w:rPr>
+              <w:t>0.660</w:t>
+            </w:r>
+          </w:p>
+        </w:tc>
+        <w:tc>
+          <w:tcPr>
+            <w:tcW w:type="dxa" w:w="1296"/>
+          </w:tcPr>
+          <w:p>
+            <w:r>
+              <w:rPr>
+                <w:rFonts w:ascii="Times New Roman" w:hAnsi="Times New Roman" w:eastAsia="Times New Roman"/>
+                <w:b w:val="0"/>
+                <w:i w:val="0"/>
+                <w:color w:val="000000"/>
+                <w:sz w:val="19"/>
+              </w:rPr>
+              <w:t>0.881</w:t>
+            </w:r>
+          </w:p>
+        </w:tc>
+      </w:tr>
+      <w:tr>
+        <w:tc>
+          <w:tcPr>
+            <w:tcW w:type="dxa" w:w="1440"/>
+          </w:tcPr>
+          <w:p>
+            <w:r>
+              <w:rPr>
+                <w:rFonts w:ascii="Times New Roman" w:hAnsi="Times New Roman" w:eastAsia="Times New Roman"/>
+                <w:b w:val="0"/>
+                <w:i w:val="0"/>
+                <w:color w:val="000000"/>
+                <w:sz w:val="19"/>
+              </w:rPr>
+              <w:t>mBRSET</w:t>
+            </w:r>
+          </w:p>
+        </w:tc>
+        <w:tc>
+          <w:tcPr>
+            <w:tcW w:type="dxa" w:w="864"/>
+          </w:tcPr>
+          <w:p>
+            <w:r>
+              <w:rPr>
+                <w:rFonts w:ascii="Times New Roman" w:hAnsi="Times New Roman" w:eastAsia="Times New Roman"/>
+                <w:b w:val="0"/>
+                <w:i w:val="0"/>
+                <w:color w:val="000000"/>
+                <w:sz w:val="19"/>
+              </w:rPr>
+              <w:t>ME</w:t>
+            </w:r>
+          </w:p>
+        </w:tc>
+        <w:tc>
+          <w:tcPr>
+            <w:tcW w:type="dxa" w:w="1584"/>
+          </w:tcPr>
+          <w:p>
+            <w:r>
+              <w:rPr>
+                <w:rFonts w:ascii="Times New Roman" w:hAnsi="Times New Roman" w:eastAsia="Times New Roman"/>
+                <w:b w:val="0"/>
+                <w:i w:val="0"/>
+                <w:color w:val="000000"/>
+                <w:sz w:val="19"/>
+              </w:rPr>
+              <w:t>F1-optimal</w:t>
+            </w:r>
+          </w:p>
+        </w:tc>
+        <w:tc>
+          <w:tcPr>
+            <w:tcW w:type="dxa" w:w="1296"/>
+          </w:tcPr>
+          <w:p>
+            <w:r>
+              <w:rPr>
+                <w:rFonts w:ascii="Times New Roman" w:hAnsi="Times New Roman" w:eastAsia="Times New Roman"/>
+                <w:b w:val="0"/>
+                <w:i w:val="0"/>
+                <w:color w:val="000000"/>
+                <w:sz w:val="19"/>
+              </w:rPr>
+              <w:t>0.807</w:t>
+            </w:r>
+          </w:p>
+        </w:tc>
+        <w:tc>
+          <w:tcPr>
+            <w:tcW w:type="dxa" w:w="1584"/>
+          </w:tcPr>
+          <w:p>
+            <w:r>
+              <w:rPr>
+                <w:rFonts w:ascii="Times New Roman" w:hAnsi="Times New Roman" w:eastAsia="Times New Roman"/>
+                <w:b w:val="0"/>
+                <w:i w:val="0"/>
+                <w:color w:val="000000"/>
+                <w:sz w:val="19"/>
+              </w:rPr>
+              <w:t>0.902</w:t>
+            </w:r>
+          </w:p>
+        </w:tc>
+        <w:tc>
+          <w:tcPr>
+            <w:tcW w:type="dxa" w:w="1296"/>
+          </w:tcPr>
+          <w:p>
+            <w:r>
+              <w:rPr>
+                <w:rFonts w:ascii="Times New Roman" w:hAnsi="Times New Roman" w:eastAsia="Times New Roman"/>
+                <w:b w:val="0"/>
+                <w:i w:val="0"/>
+                <w:color w:val="000000"/>
+                <w:sz w:val="19"/>
+              </w:rPr>
+              <w:t>0.730</w:t>
+            </w:r>
+          </w:p>
+        </w:tc>
+      </w:tr>
+      <w:tr>
+        <w:tc>
+          <w:tcPr>
+            <w:tcW w:type="dxa" w:w="1440"/>
+          </w:tcPr>
+          <w:p>
+            <w:r>
+              <w:rPr>
+                <w:rFonts w:ascii="Times New Roman" w:hAnsi="Times New Roman" w:eastAsia="Times New Roman"/>
+                <w:b w:val="0"/>
+                <w:i w:val="0"/>
+                <w:color w:val="000000"/>
+                <w:sz w:val="19"/>
+              </w:rPr>
+              <w:t>mBRSET</w:t>
+            </w:r>
+          </w:p>
+        </w:tc>
+        <w:tc>
+          <w:tcPr>
+            <w:tcW w:type="dxa" w:w="864"/>
+          </w:tcPr>
+          <w:p>
+            <w:r>
+              <w:rPr>
+                <w:rFonts w:ascii="Times New Roman" w:hAnsi="Times New Roman" w:eastAsia="Times New Roman"/>
+                <w:b w:val="0"/>
+                <w:i w:val="0"/>
+                <w:color w:val="000000"/>
+                <w:sz w:val="19"/>
+              </w:rPr>
+              <w:t>ME</w:t>
+            </w:r>
+          </w:p>
+        </w:tc>
+        <w:tc>
+          <w:tcPr>
+            <w:tcW w:type="dxa" w:w="1584"/>
+          </w:tcPr>
+          <w:p>
+            <w:r>
+              <w:rPr>
+                <w:rFonts w:ascii="Times New Roman" w:hAnsi="Times New Roman" w:eastAsia="Times New Roman"/>
+                <w:b w:val="0"/>
+                <w:i w:val="0"/>
+                <w:color w:val="000000"/>
+                <w:sz w:val="19"/>
+              </w:rPr>
+              <w:t>F2-optimal</w:t>
+            </w:r>
+          </w:p>
+        </w:tc>
+        <w:tc>
+          <w:tcPr>
+            <w:tcW w:type="dxa" w:w="1296"/>
+          </w:tcPr>
+          <w:p>
+            <w:r>
+              <w:rPr>
+                <w:rFonts w:ascii="Times New Roman" w:hAnsi="Times New Roman" w:eastAsia="Times New Roman"/>
+                <w:b w:val="0"/>
+                <w:i w:val="0"/>
+                <w:color w:val="000000"/>
+                <w:sz w:val="19"/>
+              </w:rPr>
+              <w:t>0.733</w:t>
+            </w:r>
+          </w:p>
+        </w:tc>
+        <w:tc>
+          <w:tcPr>
+            <w:tcW w:type="dxa" w:w="1584"/>
+          </w:tcPr>
+          <w:p>
+            <w:r>
+              <w:rPr>
+                <w:rFonts w:ascii="Times New Roman" w:hAnsi="Times New Roman" w:eastAsia="Times New Roman"/>
+                <w:b w:val="0"/>
+                <w:i w:val="0"/>
+                <w:color w:val="000000"/>
+                <w:sz w:val="19"/>
+              </w:rPr>
+              <w:t>0.602</w:t>
+            </w:r>
+          </w:p>
+        </w:tc>
+        <w:tc>
+          <w:tcPr>
+            <w:tcW w:type="dxa" w:w="1296"/>
+          </w:tcPr>
+          <w:p>
+            <w:r>
+              <w:rPr>
+                <w:rFonts w:ascii="Times New Roman" w:hAnsi="Times New Roman" w:eastAsia="Times New Roman"/>
+                <w:b w:val="0"/>
+                <w:i w:val="0"/>
+                <w:color w:val="000000"/>
+                <w:sz w:val="19"/>
+              </w:rPr>
+              <w:t>0.937</w:t>
+            </w:r>
+          </w:p>
+        </w:tc>
+      </w:tr>
+    </w:tbl>
+    <w:p>
+      <w:pPr>
+        <w:spacing w:after="60"/>
+      </w:pPr>
+    </w:p>
+    <w:p>
+      <w:pPr>
+        <w:spacing w:after="120"/>
+      </w:pPr>
+      <w:r>
+        <w:rPr>
+          <w:rFonts w:ascii="Times New Roman" w:hAnsi="Times New Roman" w:eastAsia="Times New Roman"/>
+          <w:b w:val="0"/>
+          <w:i w:val="0"/>
+          <w:color w:val="000000"/>
+          <w:sz w:val="21"/>
+        </w:rPr>
+        <w:t>mBRSET macular_edema shows the largest swing: recall 0.730 -&gt; 0.937 (+20.6 pts) at a real precision cost (0.902 -&gt; 0.602). This is a genuine clinical/deployment choice - which mistake is more acceptable, a missed case or a false alarm - not a model quality difference. F1-optimal thresholds remain the primary reported baseline; F2 is documented as a deliberate, available alternative if recall is prioritized.</w:t>
+      </w:r>
+    </w:p>
+    <w:p>
       <w:r>
         <w:br w:type="page"/>
       </w:r>
@@ -8136,7 +9138,7 @@
           <w:color w:val="000000"/>
           <w:sz w:val="22"/>
         </w:rPr>
-        <w:t>Final recommended models: BRSET uses the ensemble of the original and regularized checkpoints (DR F1 0.868/AUC 0.988, ME F1 0.788/AUC 0.994); mBRSET uses the regularized checkpoint alone (DR F1 0.814/AUC 0.939, ME F1 0.806/AUC 0.988). Both are real, non-fabricated results (patient-level held-out test sets, thresholds tuned only on validation data, standard metric implementations, bootstrap-confirmed) and both beat the paper's AUC benchmark on diabetic_retinopathy. The confirmed overfitting gap from Sections 4-5 was directly addressed (not just documented) via regularization and, for BRSET, ensembling - shrinking the train-test F1 gap by roughly half or more in every case.</w:t>
+        <w:t>Final recommended models: BRSET uses the ensemble of the original and regularized checkpoints (DR F1 0.868/AUC 0.988, ME F1 0.788/AUC 0.994); mBRSET uses the regularized checkpoint alone (DR F1 0.814/AUC 0.939, ME F1 0.806/AUC 0.988), both at their F1-optimal thresholds (Section 7.2 documents a recall-favoring alternative). Both are real, non-fabricated results (patient-level held-out test sets, thresholds tuned only on validation data, standard metric implementations, bootstrap-confirmed) and both beat the paper's AUC benchmark on diabetic_retinopathy. The confirmed overfitting gap from Sections 4-5 was directly addressed (not just documented) via regularization and, for BRSET, ensembling - shrinking the train-test F1 gap by roughly half or more in every case.</w:t>
       </w:r>
     </w:p>
     <w:p>
@@ -8151,7 +9153,22 @@
           <w:color w:val="000000"/>
           <w:sz w:val="22"/>
         </w:rPr>
-        <w:t>Further options considered but not pursued, with reasoning:</w:t>
+        <w:t>Planned next step (separately scoped): k-fold cross-validation, to obtain error bars from split-assignment variance on top of what the bootstrap CIs already quantify from test-set sampling variance.</w:t>
+      </w:r>
+    </w:p>
+    <w:p>
+      <w:pPr>
+        <w:spacing w:after="120"/>
+      </w:pPr>
+      <w:r>
+        <w:rPr>
+          <w:rFonts w:ascii="Times New Roman" w:hAnsi="Times New Roman" w:eastAsia="Times New Roman"/>
+          <w:b w:val="0"/>
+          <w:i w:val="0"/>
+          <w:color w:val="000000"/>
+          <w:sz w:val="22"/>
+        </w:rPr>
+        <w:t>Further options considered but deliberately not pursued now, with reasoning:</w:t>
       </w:r>
     </w:p>
     <w:p>
@@ -8166,7 +9183,7 @@
           <w:color w:val="000000"/>
           <w:sz w:val="22"/>
         </w:rPr>
-        <w:t>1. Full k-fold cross-validation - would require 3-5x retraining per dataset for a secondary source of uncertainty on top of what bootstrap CIs already quantify; not justified given shared cluster resource constraints.</w:t>
+        <w:t>1. Diffusion-based synthetic data augmentation for the rarest label (macular_edema) - a genuinely promising, literature-backed direction (e.g. class-conditioned diffusion synthesis for imbalanced DR grading), but a separate, larger undertaking requiring expert validation of synthetic image realism, not a quick strengthening step - sequenced for after or alongside cross-validation rather than rushed in beforehand.</w:t>
       </w:r>
     </w:p>
     <w:p>
@@ -8181,22 +9198,7 @@
           <w:color w:val="000000"/>
           <w:sz w:val="22"/>
         </w:rPr>
-        <w:t>2. Diffusion-based synthetic data augmentation for the rarest label (macular_edema) - a genuinely promising, literature-backed direction (e.g. class-conditioned diffusion synthesis for imbalanced DR grading), but a separate, larger undertaking rather than a quick strengthening step.</w:t>
-      </w:r>
-    </w:p>
-    <w:p>
-      <w:pPr>
-        <w:spacing w:after="100"/>
-      </w:pPr>
-      <w:r>
-        <w:rPr>
-          <w:rFonts w:ascii="Times New Roman" w:hAnsi="Times New Roman" w:eastAsia="Times New Roman"/>
-          <w:b w:val="0"/>
-          <w:i w:val="0"/>
-          <w:color w:val="000000"/>
-          <w:sz w:val="22"/>
-        </w:rPr>
-        <w:t>3. Dataset-specific regularization retuning for BRSET (lighter drop_path/mixup) - made unnecessary by ensembling, which resolved the same tradeoff for free.</w:t>
+        <w:t>2. Dataset-specific regularization retuning for BRSET (lighter drop_path/mixup) - made unnecessary by ensembling, which resolved the same tradeoff for free.</w:t>
       </w:r>
     </w:p>
     <w:p>
@@ -8211,7 +9213,7 @@
           <w:color w:val="000000"/>
           <w:sz w:val="22"/>
         </w:rPr>
-        <w:t>Recommended next step: proceed to the next planned task with these two final models as the established strong baselines.</w:t>
+        <w:t>These two final models are the established strong baselines going into k-fold cross-validation, the next planned step.</w:t>
       </w:r>
     </w:p>
     <w:sectPr>

</xml_diff>